<commit_message>
style(dashboard): réduction de la taille des cards KPI pour une meilleure proportion
</commit_message>
<xml_diff>
--- a/MEMOIRE/Memoire_EduTrack_moussa_aya.docx
+++ b/MEMOIRE/Memoire_EduTrack_moussa_aya.docx
@@ -251,7 +251,7 @@
           <w:szCs w:val="32"/>
         </w:rPr>
       </w:pPr>
-      <w:bookmarkStart w:id="0" w:name="_Toc233982639"/>
+      <w:bookmarkStart w:id="0" w:name="_Toc234354166"/>
       <w:proofErr w:type="spellStart"/>
       <w:r>
         <w:rPr>
@@ -301,7 +301,7 @@
           <w:szCs w:val="32"/>
         </w:rPr>
       </w:pPr>
-      <w:bookmarkStart w:id="1" w:name="_Toc233982640"/>
+      <w:bookmarkStart w:id="1" w:name="_Toc234354167"/>
       <w:r>
         <w:rPr>
           <w:rFonts w:ascii="Times New Roman" w:hAnsi="Times New Roman" w:cs="Times New Roman"/>
@@ -363,7 +363,7 @@
           <w:szCs w:val="32"/>
         </w:rPr>
       </w:pPr>
-      <w:bookmarkStart w:id="2" w:name="_Toc233982641"/>
+      <w:bookmarkStart w:id="2" w:name="_Toc234354168"/>
       <w:r>
         <w:rPr>
           <w:rFonts w:ascii="Times New Roman" w:hAnsi="Times New Roman" w:cs="Times New Roman"/>
@@ -505,6 +505,13 @@
       </w:r>
     </w:p>
     <w:p>
+      <w:proofErr w:type="spellStart"/>
+      <w:r>
+        <w:t>Glossaire</w:t>
+      </w:r>
+      <w:proofErr w:type="spellEnd"/>
+    </w:p>
+    <w:p>
       <w:r>
         <w:t>Table des matières</w:t>
       </w:r>
@@ -516,19 +523,26 @@
     </w:p>
     <w:p>
       <w:pPr>
+        <w:pStyle w:val="Titre1"/>
         <w:rPr>
-          <w:b/>
+          <w:rFonts w:ascii="Times New Roman" w:hAnsi="Times New Roman" w:cs="Times New Roman"/>
+          <w:color w:val="auto"/>
           <w:sz w:val="32"/>
+          <w:szCs w:val="32"/>
         </w:rPr>
       </w:pPr>
+      <w:bookmarkStart w:id="3" w:name="_Toc234354169"/>
       <w:r>
         <w:rPr>
-          <w:b/>
+          <w:rFonts w:ascii="Times New Roman" w:hAnsi="Times New Roman" w:cs="Times New Roman"/>
+          <w:color w:val="auto"/>
           <w:sz w:val="32"/>
+          <w:szCs w:val="32"/>
         </w:rPr>
         <w:lastRenderedPageBreak/>
         <w:t>Table des illustrations</w:t>
       </w:r>
+      <w:bookmarkEnd w:id="3"/>
     </w:p>
     <w:p>
       <w:pPr>
@@ -537,7 +551,12 @@
           <w:tab w:val="right" w:leader="dot" w:pos="9396"/>
         </w:tabs>
         <w:rPr>
+          <w:rFonts w:asciiTheme="minorHAnsi" w:hAnsiTheme="minorHAnsi"/>
           <w:noProof/>
+          <w:kern w:val="2"/>
+          <w:szCs w:val="24"/>
+          <w:lang w:val="fr-FR" w:eastAsia="fr-FR"/>
+          <w14:ligatures w14:val="standardContextual"/>
         </w:rPr>
       </w:pPr>
       <w:r>
@@ -549,13 +568,13 @@
       <w:r>
         <w:fldChar w:fldCharType="separate"/>
       </w:r>
-      <w:hyperlink w:anchor="_Toc233983010" w:history="1">
+      <w:hyperlink w:anchor="_Toc234354029" w:history="1">
         <w:r>
           <w:rPr>
             <w:rStyle w:val="Lienhypertexte"/>
             <w:noProof/>
           </w:rPr>
-          <w:t>Figure 1 Diagramme de cas d'utilisation du systeme EduTrack.</w:t>
+          <w:t>Figure 1: Diagramme de cas d'utilisation du systeme EduTrack.</w:t>
         </w:r>
         <w:r>
           <w:rPr>
@@ -576,7 +595,7 @@
             <w:noProof/>
             <w:webHidden/>
           </w:rPr>
-          <w:instrText xml:space="preserve"> PAGEREF _Toc233983010 \h </w:instrText>
+          <w:instrText xml:space="preserve"> PAGEREF _Toc234354029 \h </w:instrText>
         </w:r>
         <w:r>
           <w:rPr>
@@ -614,16 +633,21 @@
           <w:tab w:val="right" w:leader="dot" w:pos="9396"/>
         </w:tabs>
         <w:rPr>
+          <w:rFonts w:asciiTheme="minorHAnsi" w:hAnsiTheme="minorHAnsi"/>
           <w:noProof/>
+          <w:kern w:val="2"/>
+          <w:szCs w:val="24"/>
+          <w:lang w:val="fr-FR" w:eastAsia="fr-FR"/>
+          <w14:ligatures w14:val="standardContextual"/>
         </w:rPr>
       </w:pPr>
-      <w:hyperlink w:anchor="_Toc233983011" w:history="1">
+      <w:hyperlink w:anchor="_Toc234354030" w:history="1">
         <w:r>
           <w:rPr>
             <w:rStyle w:val="Lienhypertexte"/>
             <w:noProof/>
           </w:rPr>
-          <w:t>Figure 2 Diagramme de classes du modele de donnees du systeme EduTrack.</w:t>
+          <w:t>Figure 2: Diagramme de classes du modele de donnees du systeme EduTrack.</w:t>
         </w:r>
         <w:r>
           <w:rPr>
@@ -644,7 +668,7 @@
             <w:noProof/>
             <w:webHidden/>
           </w:rPr>
-          <w:instrText xml:space="preserve"> PAGEREF _Toc233983011 \h </w:instrText>
+          <w:instrText xml:space="preserve"> PAGEREF _Toc234354030 \h </w:instrText>
         </w:r>
         <w:r>
           <w:rPr>
@@ -682,16 +706,21 @@
           <w:tab w:val="right" w:leader="dot" w:pos="9396"/>
         </w:tabs>
         <w:rPr>
+          <w:rFonts w:asciiTheme="minorHAnsi" w:hAnsiTheme="minorHAnsi"/>
           <w:noProof/>
+          <w:kern w:val="2"/>
+          <w:szCs w:val="24"/>
+          <w:lang w:val="fr-FR" w:eastAsia="fr-FR"/>
+          <w14:ligatures w14:val="standardContextual"/>
         </w:rPr>
       </w:pPr>
-      <w:hyperlink w:anchor="_Toc233983012" w:history="1">
+      <w:hyperlink w:anchor="_Toc234354031" w:history="1">
         <w:r>
           <w:rPr>
             <w:rStyle w:val="Lienhypertexte"/>
             <w:noProof/>
           </w:rPr>
-          <w:t>Figure 3 Diagramme de sequence de l'authentification des utilisateurs du systeme EduTrack.</w:t>
+          <w:t>Figure 3: Diagramme de sequence de l'authentification des utilisateurs du systeme EduTrack.</w:t>
         </w:r>
         <w:r>
           <w:rPr>
@@ -712,7 +741,7 @@
             <w:noProof/>
             <w:webHidden/>
           </w:rPr>
-          <w:instrText xml:space="preserve"> PAGEREF _Toc233983012 \h </w:instrText>
+          <w:instrText xml:space="preserve"> PAGEREF _Toc234354031 \h </w:instrText>
         </w:r>
         <w:r>
           <w:rPr>
@@ -750,16 +779,21 @@
           <w:tab w:val="right" w:leader="dot" w:pos="9396"/>
         </w:tabs>
         <w:rPr>
+          <w:rFonts w:asciiTheme="minorHAnsi" w:hAnsiTheme="minorHAnsi"/>
           <w:noProof/>
+          <w:kern w:val="2"/>
+          <w:szCs w:val="24"/>
+          <w:lang w:val="fr-FR" w:eastAsia="fr-FR"/>
+          <w14:ligatures w14:val="standardContextual"/>
         </w:rPr>
       </w:pPr>
-      <w:hyperlink w:anchor="_Toc233983013" w:history="1">
+      <w:hyperlink w:anchor="_Toc234354032" w:history="1">
         <w:r>
           <w:rPr>
             <w:rStyle w:val="Lienhypertexte"/>
             <w:noProof/>
           </w:rPr>
-          <w:t>Figure 4 Diagramme de sequence du processus d'emargements par QR Code du systeme EduTrack.</w:t>
+          <w:t>Figure 4: Diagramme de sequence du processus d'emargements par QR Code du systeme EduTrack.</w:t>
         </w:r>
         <w:r>
           <w:rPr>
@@ -780,7 +814,7 @@
             <w:noProof/>
             <w:webHidden/>
           </w:rPr>
-          <w:instrText xml:space="preserve"> PAGEREF _Toc233983013 \h </w:instrText>
+          <w:instrText xml:space="preserve"> PAGEREF _Toc234354032 \h </w:instrText>
         </w:r>
         <w:r>
           <w:rPr>
@@ -818,16 +852,21 @@
           <w:tab w:val="right" w:leader="dot" w:pos="9396"/>
         </w:tabs>
         <w:rPr>
+          <w:rFonts w:asciiTheme="minorHAnsi" w:hAnsiTheme="minorHAnsi"/>
           <w:noProof/>
+          <w:kern w:val="2"/>
+          <w:szCs w:val="24"/>
+          <w:lang w:val="fr-FR" w:eastAsia="fr-FR"/>
+          <w14:ligatures w14:val="standardContextual"/>
         </w:rPr>
       </w:pPr>
-      <w:hyperlink w:anchor="_Toc233983014" w:history="1">
+      <w:hyperlink w:anchor="_Toc234354033" w:history="1">
         <w:r>
           <w:rPr>
             <w:rStyle w:val="Lienhypertexte"/>
             <w:noProof/>
           </w:rPr>
-          <w:t>Figure 5 Diagramme de sequence du calcul des honoraires du systeme EduTrack.</w:t>
+          <w:t>Figure 5: Diagramme de sequence du calcul des honoraires du systeme EduTrack.</w:t>
         </w:r>
         <w:r>
           <w:rPr>
@@ -848,7 +887,7 @@
             <w:noProof/>
             <w:webHidden/>
           </w:rPr>
-          <w:instrText xml:space="preserve"> PAGEREF _Toc233983014 \h </w:instrText>
+          <w:instrText xml:space="preserve"> PAGEREF _Toc234354033 \h </w:instrText>
         </w:r>
         <w:r>
           <w:rPr>
@@ -886,16 +925,21 @@
           <w:tab w:val="right" w:leader="dot" w:pos="9396"/>
         </w:tabs>
         <w:rPr>
+          <w:rFonts w:asciiTheme="minorHAnsi" w:hAnsiTheme="minorHAnsi"/>
           <w:noProof/>
+          <w:kern w:val="2"/>
+          <w:szCs w:val="24"/>
+          <w:lang w:val="fr-FR" w:eastAsia="fr-FR"/>
+          <w14:ligatures w14:val="standardContextual"/>
         </w:rPr>
       </w:pPr>
-      <w:hyperlink w:anchor="_Toc233983015" w:history="1">
+      <w:hyperlink w:anchor="_Toc234354034" w:history="1">
         <w:r>
           <w:rPr>
             <w:rStyle w:val="Lienhypertexte"/>
             <w:noProof/>
           </w:rPr>
-          <w:t>Figure 6 Architecture en trois couches du systeme EduTrack.</w:t>
+          <w:t>Figure 6: Architecture en trois couches du systeme EduTrack.</w:t>
         </w:r>
         <w:r>
           <w:rPr>
@@ -916,7 +960,7 @@
             <w:noProof/>
             <w:webHidden/>
           </w:rPr>
-          <w:instrText xml:space="preserve"> PAGEREF _Toc233983015 \h </w:instrText>
+          <w:instrText xml:space="preserve"> PAGEREF _Toc234354034 \h </w:instrText>
         </w:r>
         <w:r>
           <w:rPr>
@@ -954,16 +998,21 @@
           <w:tab w:val="right" w:leader="dot" w:pos="9396"/>
         </w:tabs>
         <w:rPr>
+          <w:rFonts w:asciiTheme="minorHAnsi" w:hAnsiTheme="minorHAnsi"/>
           <w:noProof/>
+          <w:kern w:val="2"/>
+          <w:szCs w:val="24"/>
+          <w:lang w:val="fr-FR" w:eastAsia="fr-FR"/>
+          <w14:ligatures w14:val="standardContextual"/>
         </w:rPr>
       </w:pPr>
-      <w:hyperlink w:anchor="_Toc233983016" w:history="1">
+      <w:hyperlink w:anchor="_Toc234354035" w:history="1">
         <w:r>
           <w:rPr>
             <w:rStyle w:val="Lienhypertexte"/>
             <w:noProof/>
           </w:rPr>
-          <w:t>Figure 7 Page de connexion de la plateforme EduTrack.</w:t>
+          <w:t>Figure 7: Page de connexion de la plateforme EduTrack.</w:t>
         </w:r>
         <w:r>
           <w:rPr>
@@ -984,7 +1033,7 @@
             <w:noProof/>
             <w:webHidden/>
           </w:rPr>
-          <w:instrText xml:space="preserve"> PAGEREF _Toc233983016 \h </w:instrText>
+          <w:instrText xml:space="preserve"> PAGEREF _Toc234354035 \h </w:instrText>
         </w:r>
         <w:r>
           <w:rPr>
@@ -1022,16 +1071,21 @@
           <w:tab w:val="right" w:leader="dot" w:pos="9396"/>
         </w:tabs>
         <w:rPr>
+          <w:rFonts w:asciiTheme="minorHAnsi" w:hAnsiTheme="minorHAnsi"/>
           <w:noProof/>
+          <w:kern w:val="2"/>
+          <w:szCs w:val="24"/>
+          <w:lang w:val="fr-FR" w:eastAsia="fr-FR"/>
+          <w14:ligatures w14:val="standardContextual"/>
         </w:rPr>
       </w:pPr>
-      <w:hyperlink w:anchor="_Toc233983017" w:history="1">
+      <w:hyperlink w:anchor="_Toc234354036" w:history="1">
         <w:r>
           <w:rPr>
             <w:rStyle w:val="Lienhypertexte"/>
             <w:noProof/>
           </w:rPr>
-          <w:t>Figure 8 Tableau de bord Interface Web Administrateur.</w:t>
+          <w:t>Figure 8: Tableau de bord Interface Web Administrateur.</w:t>
         </w:r>
         <w:r>
           <w:rPr>
@@ -1052,7 +1106,7 @@
             <w:noProof/>
             <w:webHidden/>
           </w:rPr>
-          <w:instrText xml:space="preserve"> PAGEREF _Toc233983017 \h </w:instrText>
+          <w:instrText xml:space="preserve"> PAGEREF _Toc234354036 \h </w:instrText>
         </w:r>
         <w:r>
           <w:rPr>
@@ -1090,16 +1144,21 @@
           <w:tab w:val="right" w:leader="dot" w:pos="9396"/>
         </w:tabs>
         <w:rPr>
+          <w:rFonts w:asciiTheme="minorHAnsi" w:hAnsiTheme="minorHAnsi"/>
           <w:noProof/>
+          <w:kern w:val="2"/>
+          <w:szCs w:val="24"/>
+          <w:lang w:val="fr-FR" w:eastAsia="fr-FR"/>
+          <w14:ligatures w14:val="standardContextual"/>
         </w:rPr>
       </w:pPr>
-      <w:hyperlink w:anchor="_Toc233983018" w:history="1">
+      <w:hyperlink w:anchor="_Toc234354037" w:history="1">
         <w:r>
           <w:rPr>
             <w:rStyle w:val="Lienhypertexte"/>
             <w:noProof/>
           </w:rPr>
-          <w:t>Figure 9 Page accueil de l'interface mobile d'EduTrack.</w:t>
+          <w:t>Figure 9: Page accueil de l'interface mobile d'EduTrack.</w:t>
         </w:r>
         <w:r>
           <w:rPr>
@@ -1120,7 +1179,7 @@
             <w:noProof/>
             <w:webHidden/>
           </w:rPr>
-          <w:instrText xml:space="preserve"> PAGEREF _Toc233983018 \h </w:instrText>
+          <w:instrText xml:space="preserve"> PAGEREF _Toc234354037 \h </w:instrText>
         </w:r>
         <w:r>
           <w:rPr>
@@ -1158,16 +1217,21 @@
           <w:tab w:val="right" w:leader="dot" w:pos="9396"/>
         </w:tabs>
         <w:rPr>
+          <w:rFonts w:asciiTheme="minorHAnsi" w:hAnsiTheme="minorHAnsi"/>
           <w:noProof/>
+          <w:kern w:val="2"/>
+          <w:szCs w:val="24"/>
+          <w:lang w:val="fr-FR" w:eastAsia="fr-FR"/>
+          <w14:ligatures w14:val="standardContextual"/>
         </w:rPr>
       </w:pPr>
-      <w:hyperlink w:anchor="_Toc233983019" w:history="1">
+      <w:hyperlink w:anchor="_Toc234354038" w:history="1">
         <w:r>
           <w:rPr>
             <w:rStyle w:val="Lienhypertexte"/>
             <w:noProof/>
           </w:rPr>
-          <w:t>Figure 10 Page de planning de l'interface mobile d'EduTrack</w:t>
+          <w:t>Figure 10: Page de planning de l'interface mobile d'EduTrack</w:t>
         </w:r>
         <w:r>
           <w:rPr>
@@ -1188,7 +1252,7 @@
             <w:noProof/>
             <w:webHidden/>
           </w:rPr>
-          <w:instrText xml:space="preserve"> PAGEREF _Toc233983019 \h </w:instrText>
+          <w:instrText xml:space="preserve"> PAGEREF _Toc234354038 \h </w:instrText>
         </w:r>
         <w:r>
           <w:rPr>
@@ -1226,16 +1290,21 @@
           <w:tab w:val="right" w:leader="dot" w:pos="9396"/>
         </w:tabs>
         <w:rPr>
+          <w:rFonts w:asciiTheme="minorHAnsi" w:hAnsiTheme="minorHAnsi"/>
           <w:noProof/>
+          <w:kern w:val="2"/>
+          <w:szCs w:val="24"/>
+          <w:lang w:val="fr-FR" w:eastAsia="fr-FR"/>
+          <w14:ligatures w14:val="standardContextual"/>
         </w:rPr>
       </w:pPr>
-      <w:hyperlink w:anchor="_Toc233983020" w:history="1">
+      <w:hyperlink w:anchor="_Toc234354039" w:history="1">
         <w:r>
           <w:rPr>
             <w:rStyle w:val="Lienhypertexte"/>
             <w:noProof/>
           </w:rPr>
-          <w:t>Figure 11 Interface mobile de gestion de la fiche de progression</w:t>
+          <w:t>Figure 11: Interface mobile de gestion de la fiche de progression</w:t>
         </w:r>
         <w:r>
           <w:rPr>
@@ -1256,7 +1325,7 @@
             <w:noProof/>
             <w:webHidden/>
           </w:rPr>
-          <w:instrText xml:space="preserve"> PAGEREF _Toc233983020 \h </w:instrText>
+          <w:instrText xml:space="preserve"> PAGEREF _Toc234354039 \h </w:instrText>
         </w:r>
         <w:r>
           <w:rPr>
@@ -1294,16 +1363,21 @@
           <w:tab w:val="right" w:leader="dot" w:pos="9396"/>
         </w:tabs>
         <w:rPr>
+          <w:rFonts w:asciiTheme="minorHAnsi" w:hAnsiTheme="minorHAnsi"/>
           <w:noProof/>
+          <w:kern w:val="2"/>
+          <w:szCs w:val="24"/>
+          <w:lang w:val="fr-FR" w:eastAsia="fr-FR"/>
+          <w14:ligatures w14:val="standardContextual"/>
         </w:rPr>
       </w:pPr>
-      <w:hyperlink w:anchor="_Toc233983021" w:history="1">
+      <w:hyperlink w:anchor="_Toc234354040" w:history="1">
         <w:r>
           <w:rPr>
             <w:rStyle w:val="Lienhypertexte"/>
             <w:noProof/>
           </w:rPr>
-          <w:t>Figure 12 Consutation mobile des honoraires calculés.</w:t>
+          <w:t>Figure 12: Consutation mobile des honoraires calculés.</w:t>
         </w:r>
         <w:r>
           <w:rPr>
@@ -1324,7 +1398,7 @@
             <w:noProof/>
             <w:webHidden/>
           </w:rPr>
-          <w:instrText xml:space="preserve"> PAGEREF _Toc233983021 \h </w:instrText>
+          <w:instrText xml:space="preserve"> PAGEREF _Toc234354040 \h </w:instrText>
         </w:r>
         <w:r>
           <w:rPr>
@@ -1362,16 +1436,21 @@
           <w:tab w:val="right" w:leader="dot" w:pos="9396"/>
         </w:tabs>
         <w:rPr>
+          <w:rFonts w:asciiTheme="minorHAnsi" w:hAnsiTheme="minorHAnsi"/>
           <w:noProof/>
+          <w:kern w:val="2"/>
+          <w:szCs w:val="24"/>
+          <w:lang w:val="fr-FR" w:eastAsia="fr-FR"/>
+          <w14:ligatures w14:val="standardContextual"/>
         </w:rPr>
       </w:pPr>
-      <w:hyperlink w:anchor="_Toc233983022" w:history="1">
+      <w:hyperlink w:anchor="_Toc234354041" w:history="1">
         <w:r>
           <w:rPr>
             <w:rStyle w:val="Lienhypertexte"/>
             <w:noProof/>
           </w:rPr>
-          <w:t>Figure 13 : Profil enseignant dans l’application mobile d'EduTrack.</w:t>
+          <w:t>Figure 13: Profil enseignant dans l’application mobile d'EduTrack.</w:t>
         </w:r>
         <w:r>
           <w:rPr>
@@ -1392,7 +1471,7 @@
             <w:noProof/>
             <w:webHidden/>
           </w:rPr>
-          <w:instrText xml:space="preserve"> PAGEREF _Toc233983022 \h </w:instrText>
+          <w:instrText xml:space="preserve"> PAGEREF _Toc234354041 \h </w:instrText>
         </w:r>
         <w:r>
           <w:rPr>
@@ -1429,42 +1508,139 @@
       </w:r>
     </w:p>
     <w:p>
-      <w:r>
+      <w:pPr>
         <w:rPr>
           <w:b/>
           <w:sz w:val="32"/>
         </w:rPr>
-        <w:t xml:space="preserve">Table des </w:t>
-      </w:r>
-      <w:proofErr w:type="spellStart"/>
-      <w:r>
+      </w:pPr>
+    </w:p>
+    <w:p>
+      <w:pPr>
         <w:rPr>
           <w:b/>
           <w:sz w:val="32"/>
         </w:rPr>
-        <w:t>sigles</w:t>
-      </w:r>
-      <w:proofErr w:type="spellEnd"/>
-      <w:r>
+      </w:pPr>
+    </w:p>
+    <w:p>
+      <w:pPr>
         <w:rPr>
           <w:b/>
           <w:sz w:val="32"/>
         </w:rPr>
-        <w:t xml:space="preserve"> et </w:t>
-      </w:r>
-      <w:proofErr w:type="spellStart"/>
-      <w:r>
+      </w:pPr>
+    </w:p>
+    <w:p>
+      <w:pPr>
         <w:rPr>
           <w:b/>
           <w:sz w:val="32"/>
         </w:rPr>
+      </w:pPr>
+    </w:p>
+    <w:p>
+      <w:pPr>
+        <w:rPr>
+          <w:b/>
+          <w:sz w:val="32"/>
+        </w:rPr>
+      </w:pPr>
+    </w:p>
+    <w:p>
+      <w:pPr>
+        <w:rPr>
+          <w:b/>
+          <w:sz w:val="32"/>
+        </w:rPr>
+      </w:pPr>
+    </w:p>
+    <w:p>
+      <w:pPr>
+        <w:rPr>
+          <w:b/>
+          <w:sz w:val="32"/>
+        </w:rPr>
+      </w:pPr>
+    </w:p>
+    <w:p>
+      <w:pPr>
+        <w:rPr>
+          <w:b/>
+          <w:sz w:val="32"/>
+        </w:rPr>
+      </w:pPr>
+    </w:p>
+    <w:p>
+      <w:pPr>
+        <w:rPr>
+          <w:b/>
+          <w:sz w:val="32"/>
+        </w:rPr>
+      </w:pPr>
+    </w:p>
+    <w:p>
+      <w:pPr>
+        <w:pStyle w:val="Titre1"/>
+        <w:rPr>
+          <w:rFonts w:ascii="Times New Roman" w:hAnsi="Times New Roman" w:cs="Times New Roman"/>
+          <w:color w:val="auto"/>
+          <w:sz w:val="32"/>
+          <w:szCs w:val="32"/>
+        </w:rPr>
+      </w:pPr>
+      <w:bookmarkStart w:id="4" w:name="_Toc234354170"/>
+      <w:r>
+        <w:rPr>
+          <w:rFonts w:ascii="Times New Roman" w:hAnsi="Times New Roman" w:cs="Times New Roman"/>
+          <w:color w:val="auto"/>
+          <w:sz w:val="32"/>
+          <w:szCs w:val="32"/>
+        </w:rPr>
+        <w:lastRenderedPageBreak/>
+        <w:t xml:space="preserve">Table des </w:t>
+      </w:r>
+      <w:proofErr w:type="spellStart"/>
+      <w:r>
+        <w:rPr>
+          <w:rFonts w:ascii="Times New Roman" w:hAnsi="Times New Roman" w:cs="Times New Roman"/>
+          <w:color w:val="auto"/>
+          <w:sz w:val="32"/>
+          <w:szCs w:val="32"/>
+        </w:rPr>
+        <w:t>sigles</w:t>
+      </w:r>
+      <w:proofErr w:type="spellEnd"/>
+      <w:r>
+        <w:rPr>
+          <w:rFonts w:ascii="Times New Roman" w:hAnsi="Times New Roman" w:cs="Times New Roman"/>
+          <w:color w:val="auto"/>
+          <w:sz w:val="32"/>
+          <w:szCs w:val="32"/>
+        </w:rPr>
+        <w:t xml:space="preserve"> et </w:t>
+      </w:r>
+      <w:proofErr w:type="spellStart"/>
+      <w:r>
+        <w:rPr>
+          <w:rFonts w:ascii="Times New Roman" w:hAnsi="Times New Roman" w:cs="Times New Roman"/>
+          <w:color w:val="auto"/>
+          <w:sz w:val="32"/>
+          <w:szCs w:val="32"/>
+        </w:rPr>
         <w:t>abréviations</w:t>
       </w:r>
+      <w:bookmarkEnd w:id="4"/>
       <w:proofErr w:type="spellEnd"/>
     </w:p>
     <w:p>
-      <w:r>
-        <w:t>API : Application Programming Interface</w:t>
+      <w:proofErr w:type="gramStart"/>
+      <w:r>
+        <w:t>API :</w:t>
+      </w:r>
+      <w:proofErr w:type="gramEnd"/>
+      <w:r>
+        <w:t xml:space="preserve"> Application Programming Interface</w:t>
       </w:r>
     </w:p>
     <w:p>
@@ -1514,7 +1690,6 @@
     </w:p>
     <w:p>
       <w:r>
-        <w:lastRenderedPageBreak/>
         <w:t>UX : User Experience</w:t>
       </w:r>
     </w:p>
@@ -1533,7 +1708,7 @@
           <w:szCs w:val="32"/>
         </w:rPr>
       </w:pPr>
-      <w:bookmarkStart w:id="3" w:name="_Toc233982642"/>
+      <w:bookmarkStart w:id="5" w:name="_Toc234354171"/>
       <w:r>
         <w:rPr>
           <w:rFonts w:ascii="Times New Roman" w:hAnsi="Times New Roman" w:cs="Times New Roman"/>
@@ -1544,7 +1719,7 @@
         <w:lastRenderedPageBreak/>
         <w:t>Résumé</w:t>
       </w:r>
-      <w:bookmarkEnd w:id="3"/>
+      <w:bookmarkEnd w:id="5"/>
     </w:p>
     <w:p/>
     <w:p>
@@ -1595,7 +1770,7 @@
           <w:szCs w:val="32"/>
         </w:rPr>
       </w:pPr>
-      <w:bookmarkStart w:id="4" w:name="_Toc233982643"/>
+      <w:bookmarkStart w:id="6" w:name="_Toc234354172"/>
       <w:r>
         <w:rPr>
           <w:rFonts w:ascii="Times New Roman" w:hAnsi="Times New Roman" w:cs="Times New Roman"/>
@@ -1606,7 +1781,7 @@
         <w:lastRenderedPageBreak/>
         <w:t>Abstract</w:t>
       </w:r>
-      <w:bookmarkEnd w:id="4"/>
+      <w:bookmarkEnd w:id="6"/>
     </w:p>
     <w:p>
       <w:r>
@@ -1655,7 +1830,7 @@
           <w:szCs w:val="32"/>
         </w:rPr>
       </w:pPr>
-      <w:bookmarkStart w:id="5" w:name="_Toc233982644"/>
+      <w:bookmarkStart w:id="7" w:name="_Toc234354173"/>
       <w:r>
         <w:rPr>
           <w:rFonts w:ascii="Times New Roman" w:hAnsi="Times New Roman" w:cs="Times New Roman"/>
@@ -1666,7 +1841,7 @@
         <w:lastRenderedPageBreak/>
         <w:t>Introduction</w:t>
       </w:r>
-      <w:bookmarkEnd w:id="5"/>
+      <w:bookmarkEnd w:id="7"/>
     </w:p>
     <w:p/>
     <w:p>
@@ -1869,7 +2044,7 @@
           <w:szCs w:val="32"/>
         </w:rPr>
       </w:pPr>
-      <w:bookmarkStart w:id="6" w:name="_Toc233982645"/>
+      <w:bookmarkStart w:id="8" w:name="_Toc234354174"/>
       <w:r>
         <w:rPr>
           <w:rFonts w:ascii="Times New Roman" w:hAnsi="Times New Roman" w:cs="Times New Roman"/>
@@ -1900,7 +2075,7 @@
         </w:rPr>
         <w:t xml:space="preserve"> Cadre théorique</w:t>
       </w:r>
-      <w:bookmarkEnd w:id="6"/>
+      <w:bookmarkEnd w:id="8"/>
     </w:p>
     <w:p/>
     <w:p>
@@ -1918,7 +2093,7 @@
           <w:szCs w:val="28"/>
         </w:rPr>
       </w:pPr>
-      <w:bookmarkStart w:id="7" w:name="_Toc233982646"/>
+      <w:bookmarkStart w:id="9" w:name="_Toc234354175"/>
       <w:r>
         <w:rPr>
           <w:rFonts w:ascii="Times New Roman" w:hAnsi="Times New Roman" w:cs="Times New Roman"/>
@@ -1948,7 +2123,7 @@
         </w:rPr>
         <w:t xml:space="preserve"> Généralités sur les systèmes de suivi pédagogique</w:t>
       </w:r>
-      <w:bookmarkEnd w:id="7"/>
+      <w:bookmarkEnd w:id="9"/>
     </w:p>
     <w:p/>
     <w:p>
@@ -1966,7 +2141,7 @@
           <w:szCs w:val="26"/>
         </w:rPr>
       </w:pPr>
-      <w:bookmarkStart w:id="8" w:name="_Toc233982647"/>
+      <w:bookmarkStart w:id="10" w:name="_Toc234354176"/>
       <w:r>
         <w:rPr>
           <w:rFonts w:ascii="Times New Roman" w:hAnsi="Times New Roman" w:cs="Times New Roman"/>
@@ -1996,7 +2171,7 @@
         </w:rPr>
         <w:t xml:space="preserve"> Concepts fondamentaux de la gestion pédagogique</w:t>
       </w:r>
-      <w:bookmarkEnd w:id="8"/>
+      <w:bookmarkEnd w:id="10"/>
     </w:p>
     <w:p/>
     <w:p>
@@ -2130,7 +2305,7 @@
           <w:szCs w:val="26"/>
         </w:rPr>
       </w:pPr>
-      <w:bookmarkStart w:id="9" w:name="_Toc233982648"/>
+      <w:bookmarkStart w:id="11" w:name="_Toc234354177"/>
       <w:r>
         <w:rPr>
           <w:rFonts w:ascii="Times New Roman" w:hAnsi="Times New Roman" w:cs="Times New Roman"/>
@@ -2160,7 +2335,7 @@
         </w:rPr>
         <w:t xml:space="preserve"> Le calcul des honoraires des enseignants</w:t>
       </w:r>
-      <w:bookmarkEnd w:id="9"/>
+      <w:bookmarkEnd w:id="11"/>
     </w:p>
     <w:p/>
     <w:p>
@@ -2174,7 +2349,13 @@
     </w:p>
     <w:p>
       <w:r>
-        <w:t>Le calcul des honoraires des enseignants est un aspect crucial de l'administration des établissements d'enseignement supérieur. Elle englobe l'ensemble des processus visant à calculer, justifier et verser les rémunérations dues aux enseignants pour leurs prestations pédagogiques.</w:t>
+        <w:t xml:space="preserve">Le calcul des honoraires des enseignants est un aspect crucial de l'administration des établissements d'enseignement supérieur. </w:t>
+      </w:r>
+      <w:r>
+        <w:t>Il</w:t>
+      </w:r>
+      <w:r>
+        <w:t xml:space="preserve"> englobe l'ensemble des processus visant à calculer, justifier et verser les rémunérations dues aux enseignants pour leurs prestations pédagogiques.</w:t>
       </w:r>
       <w:r>
         <w:br/>
@@ -2208,7 +2389,13 @@
       </w:r>
       <w:r>
         <w:br/>
-        <w:t>La suivi administratif efficace des honoraires nécessite un système fiable de collecte et de traitement des données de présence, capable de justifier chaque heure déclarée et de produire des états d’honoraires précis et vérifiables.</w:t>
+        <w:t>L</w:t>
+      </w:r>
+      <w:r>
+        <w:t>e</w:t>
+      </w:r>
+      <w:r>
+        <w:t xml:space="preserve"> suivi administratif efficace des honoraires nécessite un système fiable de collecte et de traitement des données de présence, capable de justifier chaque heure déclarée et de produire des états d’honoraires précis et vérifiables.</w:t>
       </w:r>
     </w:p>
     <w:p>
@@ -2272,7 +2459,7 @@
           <w:szCs w:val="28"/>
         </w:rPr>
       </w:pPr>
-      <w:bookmarkStart w:id="10" w:name="_Toc233982649"/>
+      <w:bookmarkStart w:id="12" w:name="_Toc234354178"/>
       <w:r>
         <w:rPr>
           <w:rFonts w:ascii="Times New Roman" w:hAnsi="Times New Roman" w:cs="Times New Roman"/>
@@ -2303,7 +2490,7 @@
         </w:rPr>
         <w:t xml:space="preserve"> Technologies et architectures de développement</w:t>
       </w:r>
-      <w:bookmarkEnd w:id="10"/>
+      <w:bookmarkEnd w:id="12"/>
     </w:p>
     <w:p/>
     <w:p>
@@ -2321,7 +2508,7 @@
           <w:szCs w:val="26"/>
         </w:rPr>
       </w:pPr>
-      <w:bookmarkStart w:id="11" w:name="_Toc233982650"/>
+      <w:bookmarkStart w:id="13" w:name="_Toc234354179"/>
       <w:r>
         <w:rPr>
           <w:rFonts w:ascii="Times New Roman" w:hAnsi="Times New Roman" w:cs="Times New Roman"/>
@@ -2351,7 +2538,7 @@
         </w:rPr>
         <w:t xml:space="preserve"> Technologies backend et bases de données</w:t>
       </w:r>
-      <w:bookmarkEnd w:id="11"/>
+      <w:bookmarkEnd w:id="13"/>
     </w:p>
     <w:p/>
     <w:p>
@@ -2526,7 +2713,7 @@
           <w:szCs w:val="26"/>
         </w:rPr>
       </w:pPr>
-      <w:bookmarkStart w:id="12" w:name="_Toc233982651"/>
+      <w:bookmarkStart w:id="14" w:name="_Toc234354180"/>
       <w:r>
         <w:rPr>
           <w:rFonts w:ascii="Times New Roman" w:hAnsi="Times New Roman" w:cs="Times New Roman"/>
@@ -2556,7 +2743,7 @@
         </w:rPr>
         <w:t xml:space="preserve"> Technologies frontend et mobile</w:t>
       </w:r>
-      <w:bookmarkEnd w:id="12"/>
+      <w:bookmarkEnd w:id="14"/>
     </w:p>
     <w:p/>
     <w:p>
@@ -2699,7 +2886,7 @@
           <w:szCs w:val="32"/>
         </w:rPr>
       </w:pPr>
-      <w:bookmarkStart w:id="13" w:name="_Toc233982652"/>
+      <w:bookmarkStart w:id="15" w:name="_Toc234354181"/>
       <w:r>
         <w:rPr>
           <w:rFonts w:ascii="Times New Roman" w:hAnsi="Times New Roman" w:cs="Times New Roman"/>
@@ -2730,7 +2917,7 @@
         </w:rPr>
         <w:t xml:space="preserve"> Cas pratique – Analyse, conception et implémentation d'EduTrack</w:t>
       </w:r>
-      <w:bookmarkEnd w:id="13"/>
+      <w:bookmarkEnd w:id="15"/>
     </w:p>
     <w:p/>
     <w:p>
@@ -2748,7 +2935,7 @@
           <w:szCs w:val="28"/>
         </w:rPr>
       </w:pPr>
-      <w:bookmarkStart w:id="14" w:name="_Toc233982653"/>
+      <w:bookmarkStart w:id="16" w:name="_Toc234354182"/>
       <w:r>
         <w:rPr>
           <w:rFonts w:ascii="Times New Roman" w:hAnsi="Times New Roman" w:cs="Times New Roman"/>
@@ -2778,7 +2965,7 @@
         </w:rPr>
         <w:t xml:space="preserve"> Analyse et conception du système</w:t>
       </w:r>
-      <w:bookmarkEnd w:id="14"/>
+      <w:bookmarkEnd w:id="16"/>
     </w:p>
     <w:p/>
     <w:p>
@@ -2796,7 +2983,7 @@
           <w:szCs w:val="26"/>
         </w:rPr>
       </w:pPr>
-      <w:bookmarkStart w:id="15" w:name="_Toc233982654"/>
+      <w:bookmarkStart w:id="17" w:name="_Toc234354183"/>
       <w:r>
         <w:rPr>
           <w:rFonts w:ascii="Times New Roman" w:hAnsi="Times New Roman" w:cs="Times New Roman"/>
@@ -2826,7 +3013,7 @@
         </w:rPr>
         <w:t xml:space="preserve"> Analyse des besoins et spécifications</w:t>
       </w:r>
-      <w:bookmarkEnd w:id="15"/>
+      <w:bookmarkEnd w:id="17"/>
     </w:p>
     <w:p/>
     <w:p>
@@ -3128,7 +3315,8 @@
         <w:pStyle w:val="Lgende"/>
         <w:jc w:val="center"/>
       </w:pPr>
-      <w:bookmarkStart w:id="16" w:name="_Toc233983010"/>
+      <w:bookmarkStart w:id="18" w:name="_Toc233983010"/>
+      <w:bookmarkStart w:id="19" w:name="_Toc234354029"/>
       <w:r>
         <w:t xml:space="preserve">Figure </w:t>
       </w:r>
@@ -3141,6 +3329,12 @@
         </w:r>
       </w:fldSimple>
       <w:r>
+        <w:rPr>
+          <w:noProof/>
+        </w:rPr>
+        <w:t>:</w:t>
+      </w:r>
+      <w:r>
         <w:t xml:space="preserve"> </w:t>
       </w:r>
       <w:proofErr w:type="spellStart"/>
@@ -3183,7 +3377,8 @@
       <w:r>
         <w:t>.</w:t>
       </w:r>
-      <w:bookmarkEnd w:id="16"/>
+      <w:bookmarkEnd w:id="18"/>
+      <w:bookmarkEnd w:id="19"/>
     </w:p>
     <w:p>
       <w:pPr>
@@ -3320,7 +3515,8 @@
         <w:pStyle w:val="Lgende"/>
         <w:jc w:val="center"/>
       </w:pPr>
-      <w:bookmarkStart w:id="17" w:name="_Toc233983011"/>
+      <w:bookmarkStart w:id="20" w:name="_Toc233983011"/>
+      <w:bookmarkStart w:id="21" w:name="_Toc234354030"/>
       <w:r>
         <w:t xml:space="preserve">Figure </w:t>
       </w:r>
@@ -3333,6 +3529,12 @@
         </w:r>
       </w:fldSimple>
       <w:r>
+        <w:rPr>
+          <w:noProof/>
+        </w:rPr>
+        <w:t>:</w:t>
+      </w:r>
+      <w:r>
         <w:t xml:space="preserve"> </w:t>
       </w:r>
       <w:proofErr w:type="spellStart"/>
@@ -3375,7 +3577,8 @@
       <w:r>
         <w:t>.</w:t>
       </w:r>
-      <w:bookmarkEnd w:id="17"/>
+      <w:bookmarkEnd w:id="20"/>
+      <w:bookmarkEnd w:id="21"/>
     </w:p>
     <w:p>
       <w:pPr>
@@ -3475,7 +3678,8 @@
         <w:pStyle w:val="Lgende"/>
         <w:jc w:val="center"/>
       </w:pPr>
-      <w:bookmarkStart w:id="18" w:name="_Toc233983012"/>
+      <w:bookmarkStart w:id="22" w:name="_Toc233983012"/>
+      <w:bookmarkStart w:id="23" w:name="_Toc234354031"/>
       <w:r>
         <w:t xml:space="preserve">Figure </w:t>
       </w:r>
@@ -3488,6 +3692,12 @@
         </w:r>
       </w:fldSimple>
       <w:r>
+        <w:rPr>
+          <w:noProof/>
+        </w:rPr>
+        <w:t>:</w:t>
+      </w:r>
+      <w:r>
         <w:t xml:space="preserve"> </w:t>
       </w:r>
       <w:proofErr w:type="spellStart"/>
@@ -3530,7 +3740,8 @@
       <w:r>
         <w:t>.</w:t>
       </w:r>
-      <w:bookmarkEnd w:id="18"/>
+      <w:bookmarkEnd w:id="22"/>
+      <w:bookmarkEnd w:id="23"/>
     </w:p>
     <w:p>
       <w:pPr>
@@ -3596,7 +3807,8 @@
         <w:pStyle w:val="Lgende"/>
         <w:jc w:val="center"/>
       </w:pPr>
-      <w:bookmarkStart w:id="19" w:name="_Toc233983013"/>
+      <w:bookmarkStart w:id="24" w:name="_Toc233983013"/>
+      <w:bookmarkStart w:id="25" w:name="_Toc234354032"/>
       <w:r>
         <w:t xml:space="preserve">Figure </w:t>
       </w:r>
@@ -3609,6 +3821,12 @@
         </w:r>
       </w:fldSimple>
       <w:r>
+        <w:rPr>
+          <w:noProof/>
+        </w:rPr>
+        <w:t>:</w:t>
+      </w:r>
+      <w:r>
         <w:t xml:space="preserve"> </w:t>
       </w:r>
       <w:proofErr w:type="spellStart"/>
@@ -3643,7 +3861,8 @@
       <w:r>
         <w:t>.</w:t>
       </w:r>
-      <w:bookmarkEnd w:id="19"/>
+      <w:bookmarkEnd w:id="24"/>
+      <w:bookmarkEnd w:id="25"/>
     </w:p>
     <w:p/>
     <w:p>
@@ -3704,7 +3923,8 @@
         <w:pStyle w:val="Lgende"/>
         <w:jc w:val="center"/>
       </w:pPr>
-      <w:bookmarkStart w:id="20" w:name="_Toc233983014"/>
+      <w:bookmarkStart w:id="26" w:name="_Toc233983014"/>
+      <w:bookmarkStart w:id="27" w:name="_Toc234354033"/>
       <w:r>
         <w:t xml:space="preserve">Figure </w:t>
       </w:r>
@@ -3717,6 +3937,12 @@
         </w:r>
       </w:fldSimple>
       <w:r>
+        <w:rPr>
+          <w:noProof/>
+        </w:rPr>
+        <w:t>:</w:t>
+      </w:r>
+      <w:r>
         <w:t xml:space="preserve"> </w:t>
       </w:r>
       <w:proofErr w:type="spellStart"/>
@@ -3759,7 +3985,8 @@
       <w:r>
         <w:t>.</w:t>
       </w:r>
-      <w:bookmarkEnd w:id="20"/>
+      <w:bookmarkEnd w:id="26"/>
+      <w:bookmarkEnd w:id="27"/>
     </w:p>
     <w:p/>
     <w:p>
@@ -3807,7 +4034,7 @@
           <w:szCs w:val="26"/>
         </w:rPr>
       </w:pPr>
-      <w:bookmarkStart w:id="21" w:name="_Toc233982655"/>
+      <w:bookmarkStart w:id="28" w:name="_Toc234354184"/>
       <w:r>
         <w:rPr>
           <w:rFonts w:ascii="Times New Roman" w:hAnsi="Times New Roman" w:cs="Times New Roman"/>
@@ -3838,7 +4065,7 @@
         </w:rPr>
         <w:t xml:space="preserve"> Architecture du système</w:t>
       </w:r>
-      <w:bookmarkEnd w:id="21"/>
+      <w:bookmarkEnd w:id="28"/>
     </w:p>
     <w:p/>
     <w:p>
@@ -3977,7 +4204,8 @@
         <w:pStyle w:val="Lgende"/>
         <w:jc w:val="center"/>
       </w:pPr>
-      <w:bookmarkStart w:id="22" w:name="_Toc233983015"/>
+      <w:bookmarkStart w:id="29" w:name="_Toc233983015"/>
+      <w:bookmarkStart w:id="30" w:name="_Toc234354034"/>
       <w:r>
         <w:t xml:space="preserve">Figure </w:t>
       </w:r>
@@ -3990,6 +4218,12 @@
         </w:r>
       </w:fldSimple>
       <w:r>
+        <w:rPr>
+          <w:noProof/>
+        </w:rPr>
+        <w:t>:</w:t>
+      </w:r>
+      <w:r>
         <w:t xml:space="preserve"> Architecture </w:t>
       </w:r>
       <w:proofErr w:type="spellStart"/>
@@ -4016,7 +4250,8 @@
       <w:r>
         <w:t>.</w:t>
       </w:r>
-      <w:bookmarkEnd w:id="22"/>
+      <w:bookmarkEnd w:id="29"/>
+      <w:bookmarkEnd w:id="30"/>
     </w:p>
     <w:p>
       <w:pPr>
@@ -4120,7 +4355,7 @@
           <w:szCs w:val="28"/>
         </w:rPr>
       </w:pPr>
-      <w:bookmarkStart w:id="23" w:name="_Toc233982656"/>
+      <w:bookmarkStart w:id="31" w:name="_Toc234354185"/>
       <w:r>
         <w:rPr>
           <w:rFonts w:ascii="Times New Roman" w:hAnsi="Times New Roman" w:cs="Times New Roman"/>
@@ -4151,7 +4386,7 @@
         </w:rPr>
         <w:t xml:space="preserve"> Implémentation et validation</w:t>
       </w:r>
-      <w:bookmarkEnd w:id="23"/>
+      <w:bookmarkEnd w:id="31"/>
     </w:p>
     <w:p/>
     <w:p>
@@ -4169,7 +4404,7 @@
           <w:szCs w:val="26"/>
         </w:rPr>
       </w:pPr>
-      <w:bookmarkStart w:id="24" w:name="_Toc233982657"/>
+      <w:bookmarkStart w:id="32" w:name="_Toc234354186"/>
       <w:r>
         <w:rPr>
           <w:rFonts w:ascii="Times New Roman" w:hAnsi="Times New Roman" w:cs="Times New Roman"/>
@@ -4199,7 +4434,7 @@
         </w:rPr>
         <w:t xml:space="preserve"> Implémentation du backend et frontend web</w:t>
       </w:r>
-      <w:bookmarkEnd w:id="24"/>
+      <w:bookmarkEnd w:id="32"/>
     </w:p>
     <w:p/>
     <w:p>
@@ -4357,7 +4592,7 @@
           <w:szCs w:val="26"/>
         </w:rPr>
       </w:pPr>
-      <w:bookmarkStart w:id="25" w:name="_Toc233982658"/>
+      <w:bookmarkStart w:id="33" w:name="_Toc234354187"/>
       <w:r>
         <w:rPr>
           <w:rFonts w:ascii="Times New Roman" w:hAnsi="Times New Roman" w:cs="Times New Roman"/>
@@ -4387,7 +4622,7 @@
         </w:rPr>
         <w:t xml:space="preserve"> Implémentation mobile et tests</w:t>
       </w:r>
-      <w:bookmarkEnd w:id="25"/>
+      <w:bookmarkEnd w:id="33"/>
     </w:p>
     <w:p/>
     <w:p>
@@ -5870,7 +6105,7 @@
           <w:szCs w:val="32"/>
         </w:rPr>
       </w:pPr>
-      <w:bookmarkStart w:id="26" w:name="_Toc233982659"/>
+      <w:bookmarkStart w:id="34" w:name="_Toc234354188"/>
       <w:r>
         <w:rPr>
           <w:rFonts w:ascii="Times New Roman" w:hAnsi="Times New Roman" w:cs="Times New Roman"/>
@@ -5880,7 +6115,7 @@
         </w:rPr>
         <w:t>Conclusion</w:t>
       </w:r>
-      <w:bookmarkEnd w:id="26"/>
+      <w:bookmarkEnd w:id="34"/>
     </w:p>
     <w:p/>
     <w:p>
@@ -6001,7 +6236,7 @@
           <w:szCs w:val="32"/>
         </w:rPr>
       </w:pPr>
-      <w:bookmarkStart w:id="27" w:name="_Toc233982660"/>
+      <w:bookmarkStart w:id="35" w:name="_Toc234354189"/>
       <w:r>
         <w:rPr>
           <w:rFonts w:ascii="Times New Roman" w:hAnsi="Times New Roman" w:cs="Times New Roman"/>
@@ -6012,7 +6247,7 @@
         <w:lastRenderedPageBreak/>
         <w:t>Bibliographie</w:t>
       </w:r>
-      <w:bookmarkEnd w:id="27"/>
+      <w:bookmarkEnd w:id="35"/>
     </w:p>
     <w:p>
       <w:pPr>
@@ -6225,296 +6460,6 @@
       <w:r>
         <w:br/>
         <w:t>Consulté dans le cadre de la rédaction du mémoire.</w:t>
-      </w:r>
-    </w:p>
-    <w:p>
-      <w:pPr>
-        <w:pStyle w:val="Titre1"/>
-        <w:rPr>
-          <w:rFonts w:ascii="Times New Roman" w:hAnsi="Times New Roman" w:cs="Times New Roman"/>
-          <w:color w:val="000000" w:themeColor="text1"/>
-          <w:sz w:val="32"/>
-          <w:szCs w:val="32"/>
-        </w:rPr>
-      </w:pPr>
-      <w:bookmarkStart w:id="28" w:name="_Toc233982661"/>
-      <w:r>
-        <w:rPr>
-          <w:rFonts w:ascii="Times New Roman" w:hAnsi="Times New Roman" w:cs="Times New Roman"/>
-          <w:color w:val="000000" w:themeColor="text1"/>
-          <w:sz w:val="32"/>
-          <w:szCs w:val="32"/>
-        </w:rPr>
-        <w:t>Glossaire</w:t>
-      </w:r>
-      <w:bookmarkEnd w:id="28"/>
-    </w:p>
-    <w:p/>
-    <w:p>
-      <w:pPr>
-        <w:spacing w:after="40"/>
-      </w:pPr>
-      <w:r>
-        <w:rPr>
-          <w:b/>
-        </w:rPr>
-        <w:t xml:space="preserve">API : </w:t>
-      </w:r>
-      <w:r>
-        <w:t>Application Programming Interface (Interface de programmation applicative)</w:t>
-      </w:r>
-    </w:p>
-    <w:p>
-      <w:pPr>
-        <w:spacing w:after="40"/>
-      </w:pPr>
-      <w:r>
-        <w:rPr>
-          <w:b/>
-        </w:rPr>
-        <w:t xml:space="preserve">CRUD : </w:t>
-      </w:r>
-      <w:r>
-        <w:t>Create, Read, Update, Delete (Créer, Lire, Mettre à jour, Supprimer)</w:t>
-      </w:r>
-    </w:p>
-    <w:p>
-      <w:pPr>
-        <w:spacing w:after="40"/>
-      </w:pPr>
-      <w:r>
-        <w:rPr>
-          <w:b/>
-        </w:rPr>
-        <w:t xml:space="preserve">DDL : </w:t>
-      </w:r>
-      <w:r>
-        <w:t>Data Definition Language (Langage de définition de données)</w:t>
-      </w:r>
-    </w:p>
-    <w:p>
-      <w:pPr>
-        <w:spacing w:after="40"/>
-      </w:pPr>
-      <w:r>
-        <w:rPr>
-          <w:b/>
-        </w:rPr>
-        <w:t xml:space="preserve">DTO : </w:t>
-      </w:r>
-      <w:r>
-        <w:t>Data Transfer Object (Objet de transfert de données)</w:t>
-      </w:r>
-    </w:p>
-    <w:p>
-      <w:pPr>
-        <w:spacing w:after="40"/>
-      </w:pPr>
-      <w:r>
-        <w:rPr>
-          <w:b/>
-        </w:rPr>
-        <w:t xml:space="preserve">HTTP : </w:t>
-      </w:r>
-      <w:r>
-        <w:t>HyperText Transfer Protocol (Protocole de transfert hypertexte)</w:t>
-      </w:r>
-    </w:p>
-    <w:p>
-      <w:pPr>
-        <w:spacing w:after="40"/>
-      </w:pPr>
-      <w:r>
-        <w:rPr>
-          <w:b/>
-        </w:rPr>
-        <w:t xml:space="preserve">IDE : </w:t>
-      </w:r>
-      <w:r>
-        <w:t>Integrated Development Environment (Environnement de développement intégré)</w:t>
-      </w:r>
-    </w:p>
-    <w:p>
-      <w:pPr>
-        <w:spacing w:after="40"/>
-      </w:pPr>
-      <w:r>
-        <w:rPr>
-          <w:b/>
-        </w:rPr>
-        <w:t xml:space="preserve">JDK : </w:t>
-      </w:r>
-      <w:r>
-        <w:t>Java Development Kit (Kit de développement Java)</w:t>
-      </w:r>
-    </w:p>
-    <w:p>
-      <w:pPr>
-        <w:spacing w:after="40"/>
-      </w:pPr>
-      <w:r>
-        <w:rPr>
-          <w:b/>
-        </w:rPr>
-        <w:t xml:space="preserve">JPA : </w:t>
-      </w:r>
-      <w:r>
-        <w:t>Jakarta Persistence API (API de persistance Jakarta)</w:t>
-      </w:r>
-    </w:p>
-    <w:p>
-      <w:pPr>
-        <w:spacing w:after="40"/>
-      </w:pPr>
-      <w:r>
-        <w:rPr>
-          <w:b/>
-        </w:rPr>
-        <w:t xml:space="preserve">JSON : </w:t>
-      </w:r>
-      <w:r>
-        <w:t>JavaScript Object Notation (Notation objet JavaScript)</w:t>
-      </w:r>
-    </w:p>
-    <w:p>
-      <w:pPr>
-        <w:spacing w:after="40"/>
-      </w:pPr>
-      <w:r>
-        <w:rPr>
-          <w:b/>
-        </w:rPr>
-        <w:t xml:space="preserve">JWT : </w:t>
-      </w:r>
-      <w:r>
-        <w:t>JSON Web Token (Jeton web JSON)</w:t>
-      </w:r>
-    </w:p>
-    <w:p>
-      <w:pPr>
-        <w:spacing w:after="40"/>
-      </w:pPr>
-      <w:r>
-        <w:rPr>
-          <w:b/>
-        </w:rPr>
-        <w:t xml:space="preserve">JVM : </w:t>
-      </w:r>
-      <w:r>
-        <w:t>Java Virtual Machine (Machine virtuelle Java)</w:t>
-      </w:r>
-    </w:p>
-    <w:p>
-      <w:pPr>
-        <w:spacing w:after="40"/>
-      </w:pPr>
-      <w:r>
-        <w:rPr>
-          <w:b/>
-        </w:rPr>
-        <w:lastRenderedPageBreak/>
-        <w:t xml:space="preserve">MVC : </w:t>
-      </w:r>
-      <w:r>
-        <w:t>Model-View-Controller (Modèle-Vue-Contrôleur)</w:t>
-      </w:r>
-    </w:p>
-    <w:p>
-      <w:pPr>
-        <w:spacing w:after="40"/>
-      </w:pPr>
-      <w:r>
-        <w:rPr>
-          <w:b/>
-        </w:rPr>
-        <w:t xml:space="preserve">ORM : </w:t>
-      </w:r>
-      <w:r>
-        <w:t>Object-Relational Mapping (Mapping objet-relationnel)</w:t>
-      </w:r>
-    </w:p>
-    <w:p>
-      <w:pPr>
-        <w:spacing w:after="40"/>
-      </w:pPr>
-      <w:r>
-        <w:rPr>
-          <w:b/>
-        </w:rPr>
-        <w:t xml:space="preserve">PFE : </w:t>
-      </w:r>
-      <w:r>
-        <w:t>Projet de Fin d'Études</w:t>
-      </w:r>
-    </w:p>
-    <w:p>
-      <w:pPr>
-        <w:spacing w:after="40"/>
-      </w:pPr>
-      <w:r>
-        <w:rPr>
-          <w:b/>
-        </w:rPr>
-        <w:t xml:space="preserve">REST : </w:t>
-      </w:r>
-      <w:r>
-        <w:t>Representational State Transfer (Transfert d'état représentationnel)</w:t>
-      </w:r>
-    </w:p>
-    <w:p>
-      <w:pPr>
-        <w:spacing w:after="40"/>
-      </w:pPr>
-      <w:r>
-        <w:rPr>
-          <w:b/>
-        </w:rPr>
-        <w:t xml:space="preserve">SPA : </w:t>
-      </w:r>
-      <w:r>
-        <w:t>Single Page Application (Application monopage)</w:t>
-      </w:r>
-    </w:p>
-    <w:p>
-      <w:pPr>
-        <w:spacing w:after="40"/>
-      </w:pPr>
-      <w:r>
-        <w:rPr>
-          <w:b/>
-        </w:rPr>
-        <w:t xml:space="preserve">SQL : </w:t>
-      </w:r>
-      <w:r>
-        <w:t>Structured Query Language (Langage de requête structuré)</w:t>
-      </w:r>
-    </w:p>
-    <w:p>
-      <w:pPr>
-        <w:spacing w:after="40"/>
-      </w:pPr>
-      <w:r>
-        <w:rPr>
-          <w:b/>
-        </w:rPr>
-        <w:t xml:space="preserve">UML : </w:t>
-      </w:r>
-      <w:r>
-        <w:t>Unified Modeling Language (Langage de modélisation unifié)</w:t>
-      </w:r>
-    </w:p>
-    <w:p>
-      <w:pPr>
-        <w:spacing w:after="40"/>
-      </w:pPr>
-      <w:r>
-        <w:rPr>
-          <w:b/>
-        </w:rPr>
-        <w:t xml:space="preserve">UX : </w:t>
-      </w:r>
-      <w:r>
-        <w:t>User Experience (Expérience utilisateur)</w:t>
       </w:r>
     </w:p>
     <w:p>
@@ -6531,26 +6476,26 @@
     </w:p>
     <w:p>
       <w:pPr>
+        <w:pStyle w:val="Titre1"/>
         <w:rPr>
-          <w:rFonts w:cs="Times New Roman"/>
-          <w:color w:val="000000" w:themeColor="text1"/>
+          <w:rFonts w:ascii="Times New Roman" w:hAnsi="Times New Roman" w:cs="Times New Roman"/>
+          <w:color w:val="auto"/>
           <w:sz w:val="32"/>
           <w:szCs w:val="32"/>
         </w:rPr>
       </w:pPr>
-      <w:bookmarkStart w:id="29" w:name="_Toc233982662"/>
+      <w:bookmarkStart w:id="36" w:name="_Toc234354190"/>
       <w:r>
         <w:rPr>
-          <w:rFonts w:cs="Times New Roman"/>
-          <w:b/>
-          <w:color w:val="000000" w:themeColor="text1"/>
+          <w:rFonts w:ascii="Times New Roman" w:hAnsi="Times New Roman" w:cs="Times New Roman"/>
+          <w:color w:val="auto"/>
           <w:sz w:val="32"/>
           <w:szCs w:val="32"/>
         </w:rPr>
         <w:lastRenderedPageBreak/>
         <w:t>Annexes</w:t>
       </w:r>
-      <w:bookmarkEnd w:id="29"/>
+      <w:bookmarkEnd w:id="36"/>
     </w:p>
     <w:p>
       <w:pPr>
@@ -6635,7 +6580,8 @@
         <w:pStyle w:val="Lgende"/>
         <w:jc w:val="center"/>
       </w:pPr>
-      <w:bookmarkStart w:id="30" w:name="_Toc233983016"/>
+      <w:bookmarkStart w:id="37" w:name="_Toc233983016"/>
+      <w:bookmarkStart w:id="38" w:name="_Toc234354035"/>
       <w:r>
         <w:t xml:space="preserve">Figure </w:t>
       </w:r>
@@ -6648,6 +6594,12 @@
         </w:r>
       </w:fldSimple>
       <w:r>
+        <w:rPr>
+          <w:noProof/>
+        </w:rPr>
+        <w:t>:</w:t>
+      </w:r>
+      <w:r>
         <w:t xml:space="preserve"> Page de </w:t>
       </w:r>
       <w:proofErr w:type="spellStart"/>
@@ -6674,7 +6626,8 @@
       <w:r>
         <w:t>.</w:t>
       </w:r>
-      <w:bookmarkEnd w:id="30"/>
+      <w:bookmarkEnd w:id="37"/>
+      <w:bookmarkEnd w:id="38"/>
     </w:p>
     <w:p/>
     <w:p>
@@ -6729,7 +6682,8 @@
         <w:pStyle w:val="Lgende"/>
         <w:jc w:val="center"/>
       </w:pPr>
-      <w:bookmarkStart w:id="31" w:name="_Toc233983017"/>
+      <w:bookmarkStart w:id="39" w:name="_Toc233983017"/>
+      <w:bookmarkStart w:id="40" w:name="_Toc234354036"/>
       <w:r>
         <w:t xml:space="preserve">Figure </w:t>
       </w:r>
@@ -6742,6 +6696,12 @@
         </w:r>
       </w:fldSimple>
       <w:r>
+        <w:rPr>
+          <w:noProof/>
+        </w:rPr>
+        <w:t>:</w:t>
+      </w:r>
+      <w:r>
         <w:t xml:space="preserve"> Tableau de bord Interface Web </w:t>
       </w:r>
       <w:proofErr w:type="spellStart"/>
@@ -6752,7 +6712,8 @@
       <w:r>
         <w:t>.</w:t>
       </w:r>
-      <w:bookmarkEnd w:id="31"/>
+      <w:bookmarkEnd w:id="39"/>
+      <w:bookmarkEnd w:id="40"/>
     </w:p>
     <w:p>
       <w:pPr>
@@ -6807,7 +6768,8 @@
         <w:pStyle w:val="Lgende"/>
         <w:jc w:val="center"/>
       </w:pPr>
-      <w:bookmarkStart w:id="32" w:name="_Toc233983018"/>
+      <w:bookmarkStart w:id="41" w:name="_Toc233983018"/>
+      <w:bookmarkStart w:id="42" w:name="_Toc234354037"/>
       <w:r>
         <w:t xml:space="preserve">Figure </w:t>
       </w:r>
@@ -6820,6 +6782,12 @@
         </w:r>
       </w:fldSimple>
       <w:r>
+        <w:rPr>
+          <w:noProof/>
+        </w:rPr>
+        <w:t>:</w:t>
+      </w:r>
+      <w:r>
         <w:t xml:space="preserve"> Page </w:t>
       </w:r>
       <w:proofErr w:type="spellStart"/>
@@ -6846,7 +6814,8 @@
       <w:r>
         <w:t>.</w:t>
       </w:r>
-      <w:bookmarkEnd w:id="32"/>
+      <w:bookmarkEnd w:id="41"/>
+      <w:bookmarkEnd w:id="42"/>
     </w:p>
     <w:p>
       <w:pPr>
@@ -6901,7 +6870,8 @@
         <w:pStyle w:val="Lgende"/>
         <w:jc w:val="center"/>
       </w:pPr>
-      <w:bookmarkStart w:id="33" w:name="_Toc233983019"/>
+      <w:bookmarkStart w:id="43" w:name="_Toc233983019"/>
+      <w:bookmarkStart w:id="44" w:name="_Toc234354038"/>
       <w:r>
         <w:t xml:space="preserve">Figure </w:t>
       </w:r>
@@ -6914,6 +6884,12 @@
         </w:r>
       </w:fldSimple>
       <w:r>
+        <w:rPr>
+          <w:noProof/>
+        </w:rPr>
+        <w:t>:</w:t>
+      </w:r>
+      <w:r>
         <w:t xml:space="preserve"> Page de planning </w:t>
       </w:r>
       <w:r>
@@ -6931,7 +6907,8 @@
       <w:r>
         <w:t>d'EduTrack</w:t>
       </w:r>
-      <w:bookmarkEnd w:id="33"/>
+      <w:bookmarkEnd w:id="43"/>
+      <w:bookmarkEnd w:id="44"/>
       <w:proofErr w:type="spellEnd"/>
     </w:p>
     <w:p>
@@ -6987,7 +6964,8 @@
         <w:pStyle w:val="Lgende"/>
         <w:jc w:val="center"/>
       </w:pPr>
-      <w:bookmarkStart w:id="34" w:name="_Toc233983020"/>
+      <w:bookmarkStart w:id="45" w:name="_Toc233983020"/>
+      <w:bookmarkStart w:id="46" w:name="_Toc234354039"/>
       <w:r>
         <w:t xml:space="preserve">Figure </w:t>
       </w:r>
@@ -7000,12 +6978,19 @@
         </w:r>
       </w:fldSimple>
       <w:r>
+        <w:rPr>
+          <w:noProof/>
+        </w:rPr>
+        <w:t>:</w:t>
+      </w:r>
+      <w:r>
         <w:t xml:space="preserve"> </w:t>
       </w:r>
       <w:r>
         <w:t>Interface mobile de gestion de la fiche de progression</w:t>
       </w:r>
-      <w:bookmarkEnd w:id="34"/>
+      <w:bookmarkEnd w:id="45"/>
+      <w:bookmarkEnd w:id="46"/>
     </w:p>
     <w:p>
       <w:pPr>
@@ -7060,7 +7045,8 @@
         <w:pStyle w:val="Lgende"/>
         <w:jc w:val="center"/>
       </w:pPr>
-      <w:bookmarkStart w:id="35" w:name="_Toc233983021"/>
+      <w:bookmarkStart w:id="47" w:name="_Toc233983021"/>
+      <w:bookmarkStart w:id="48" w:name="_Toc234354040"/>
       <w:r>
         <w:t xml:space="preserve">Figure </w:t>
       </w:r>
@@ -7073,6 +7059,12 @@
         </w:r>
       </w:fldSimple>
       <w:r>
+        <w:rPr>
+          <w:noProof/>
+        </w:rPr>
+        <w:t>:</w:t>
+      </w:r>
+      <w:r>
         <w:t xml:space="preserve"> </w:t>
       </w:r>
       <w:proofErr w:type="spellStart"/>
@@ -7099,7 +7091,8 @@
       <w:r>
         <w:t>.</w:t>
       </w:r>
-      <w:bookmarkEnd w:id="35"/>
+      <w:bookmarkEnd w:id="47"/>
+      <w:bookmarkEnd w:id="48"/>
     </w:p>
     <w:p>
       <w:pPr>
@@ -7154,7 +7147,8 @@
         <w:pStyle w:val="Lgende"/>
         <w:jc w:val="center"/>
       </w:pPr>
-      <w:bookmarkStart w:id="36" w:name="_Toc233983022"/>
+      <w:bookmarkStart w:id="49" w:name="_Toc233983022"/>
+      <w:bookmarkStart w:id="50" w:name="_Toc234354041"/>
       <w:r>
         <w:t xml:space="preserve">Figure </w:t>
       </w:r>
@@ -7167,47 +7161,45 @@
         </w:r>
       </w:fldSimple>
       <w:r>
+        <w:t xml:space="preserve">: </w:t>
+      </w:r>
+      <w:proofErr w:type="spellStart"/>
+      <w:r>
+        <w:t>Profil</w:t>
+      </w:r>
+      <w:proofErr w:type="spellEnd"/>
+      <w:r>
         <w:t xml:space="preserve"> </w:t>
       </w:r>
-      <w:r>
-        <w:t xml:space="preserve">: </w:t>
-      </w:r>
       <w:proofErr w:type="spellStart"/>
       <w:r>
-        <w:t>Profil</w:t>
+        <w:t>enseignant</w:t>
       </w:r>
       <w:proofErr w:type="spellEnd"/>
       <w:r>
+        <w:t xml:space="preserve"> dans </w:t>
+      </w:r>
+      <w:proofErr w:type="spellStart"/>
+      <w:r>
+        <w:t>l’application</w:t>
+      </w:r>
+      <w:proofErr w:type="spellEnd"/>
+      <w:r>
+        <w:t xml:space="preserve"> mobile</w:t>
+      </w:r>
+      <w:r>
         <w:t xml:space="preserve"> </w:t>
       </w:r>
       <w:proofErr w:type="spellStart"/>
       <w:r>
-        <w:t>enseignant</w:t>
+        <w:t>d'EduTrack</w:t>
       </w:r>
       <w:proofErr w:type="spellEnd"/>
       <w:r>
-        <w:t xml:space="preserve"> dans </w:t>
-      </w:r>
-      <w:proofErr w:type="spellStart"/>
-      <w:r>
-        <w:t>l’application</w:t>
-      </w:r>
-      <w:proofErr w:type="spellEnd"/>
-      <w:r>
-        <w:t xml:space="preserve"> mobile</w:t>
-      </w:r>
-      <w:r>
-        <w:t xml:space="preserve"> </w:t>
-      </w:r>
-      <w:proofErr w:type="spellStart"/>
-      <w:r>
-        <w:t>d'EduTrack</w:t>
-      </w:r>
-      <w:proofErr w:type="spellEnd"/>
-      <w:r>
         <w:t>.</w:t>
       </w:r>
-      <w:bookmarkEnd w:id="36"/>
+      <w:bookmarkEnd w:id="49"/>
+      <w:bookmarkEnd w:id="50"/>
     </w:p>
     <w:p/>
     <w:p/>
@@ -7217,18 +7209,735 @@
     <w:p/>
     <w:p/>
     <w:p/>
+    <w:p>
+      <w:pPr>
+        <w:pStyle w:val="Titre1"/>
+        <w:rPr>
+          <w:rFonts w:ascii="Times New Roman" w:hAnsi="Times New Roman" w:cs="Times New Roman"/>
+          <w:color w:val="000000" w:themeColor="text1"/>
+          <w:sz w:val="32"/>
+          <w:szCs w:val="32"/>
+        </w:rPr>
+      </w:pPr>
+      <w:bookmarkStart w:id="51" w:name="_Toc233982661"/>
+      <w:bookmarkStart w:id="52" w:name="_Toc234354191"/>
+      <w:proofErr w:type="spellStart"/>
+      <w:r>
+        <w:rPr>
+          <w:rFonts w:ascii="Times New Roman" w:hAnsi="Times New Roman" w:cs="Times New Roman"/>
+          <w:color w:val="000000" w:themeColor="text1"/>
+          <w:sz w:val="32"/>
+          <w:szCs w:val="32"/>
+        </w:rPr>
+        <w:lastRenderedPageBreak/>
+        <w:t>Glossaire</w:t>
+      </w:r>
+      <w:bookmarkEnd w:id="51"/>
+      <w:bookmarkEnd w:id="52"/>
+      <w:proofErr w:type="spellEnd"/>
+    </w:p>
+    <w:p/>
+    <w:p>
+      <w:pPr>
+        <w:spacing w:after="40"/>
+      </w:pPr>
+      <w:proofErr w:type="gramStart"/>
+      <w:r>
+        <w:rPr>
+          <w:b/>
+        </w:rPr>
+        <w:t>API :</w:t>
+      </w:r>
+      <w:proofErr w:type="gramEnd"/>
+      <w:r>
+        <w:rPr>
+          <w:b/>
+        </w:rPr>
+        <w:t xml:space="preserve"> </w:t>
+      </w:r>
+      <w:r>
+        <w:t xml:space="preserve">Application Programming Interface (Interface de </w:t>
+      </w:r>
+      <w:proofErr w:type="spellStart"/>
+      <w:r>
+        <w:t>programmation</w:t>
+      </w:r>
+      <w:proofErr w:type="spellEnd"/>
+      <w:r>
+        <w:t xml:space="preserve"> applicative)</w:t>
+      </w:r>
+    </w:p>
+    <w:p>
+      <w:pPr>
+        <w:spacing w:after="40"/>
+      </w:pPr>
+      <w:proofErr w:type="gramStart"/>
+      <w:r>
+        <w:rPr>
+          <w:b/>
+        </w:rPr>
+        <w:t>CRUD :</w:t>
+      </w:r>
+      <w:proofErr w:type="gramEnd"/>
+      <w:r>
+        <w:rPr>
+          <w:b/>
+        </w:rPr>
+        <w:t xml:space="preserve"> </w:t>
+      </w:r>
+      <w:r>
+        <w:t>Create, Read, Update, Delete (</w:t>
+      </w:r>
+      <w:proofErr w:type="spellStart"/>
+      <w:r>
+        <w:t>Créer</w:t>
+      </w:r>
+      <w:proofErr w:type="spellEnd"/>
+      <w:r>
+        <w:t xml:space="preserve">, Lire, </w:t>
+      </w:r>
+      <w:proofErr w:type="spellStart"/>
+      <w:r>
+        <w:t>Mettre</w:t>
+      </w:r>
+      <w:proofErr w:type="spellEnd"/>
+      <w:r>
+        <w:t xml:space="preserve"> à jour, </w:t>
+      </w:r>
+      <w:proofErr w:type="spellStart"/>
+      <w:r>
+        <w:t>Supprimer</w:t>
+      </w:r>
+      <w:proofErr w:type="spellEnd"/>
+      <w:r>
+        <w:t>)</w:t>
+      </w:r>
+    </w:p>
+    <w:p>
+      <w:pPr>
+        <w:spacing w:after="40"/>
+      </w:pPr>
+      <w:proofErr w:type="gramStart"/>
+      <w:r>
+        <w:rPr>
+          <w:b/>
+        </w:rPr>
+        <w:t>DDL :</w:t>
+      </w:r>
+      <w:proofErr w:type="gramEnd"/>
+      <w:r>
+        <w:rPr>
+          <w:b/>
+        </w:rPr>
+        <w:t xml:space="preserve"> </w:t>
+      </w:r>
+      <w:r>
+        <w:t>Data Definition Language (</w:t>
+      </w:r>
+      <w:proofErr w:type="spellStart"/>
+      <w:r>
+        <w:t>Langage</w:t>
+      </w:r>
+      <w:proofErr w:type="spellEnd"/>
+      <w:r>
+        <w:t xml:space="preserve"> de </w:t>
+      </w:r>
+      <w:proofErr w:type="spellStart"/>
+      <w:r>
+        <w:t>définition</w:t>
+      </w:r>
+      <w:proofErr w:type="spellEnd"/>
+      <w:r>
+        <w:t xml:space="preserve"> de données)</w:t>
+      </w:r>
+    </w:p>
+    <w:p>
+      <w:pPr>
+        <w:spacing w:after="40"/>
+      </w:pPr>
+      <w:proofErr w:type="gramStart"/>
+      <w:r>
+        <w:rPr>
+          <w:b/>
+        </w:rPr>
+        <w:t>DTO :</w:t>
+      </w:r>
+      <w:proofErr w:type="gramEnd"/>
+      <w:r>
+        <w:rPr>
+          <w:b/>
+        </w:rPr>
+        <w:t xml:space="preserve"> </w:t>
+      </w:r>
+      <w:r>
+        <w:t>Data Transfer Object (</w:t>
+      </w:r>
+      <w:proofErr w:type="spellStart"/>
+      <w:r>
+        <w:t>Objet</w:t>
+      </w:r>
+      <w:proofErr w:type="spellEnd"/>
+      <w:r>
+        <w:t xml:space="preserve"> de </w:t>
+      </w:r>
+      <w:proofErr w:type="spellStart"/>
+      <w:r>
+        <w:t>transfert</w:t>
+      </w:r>
+      <w:proofErr w:type="spellEnd"/>
+      <w:r>
+        <w:t xml:space="preserve"> de données)</w:t>
+      </w:r>
+    </w:p>
+    <w:p>
+      <w:pPr>
+        <w:spacing w:after="40"/>
+      </w:pPr>
+      <w:proofErr w:type="gramStart"/>
+      <w:r>
+        <w:rPr>
+          <w:b/>
+        </w:rPr>
+        <w:t>HTTP :</w:t>
+      </w:r>
+      <w:proofErr w:type="gramEnd"/>
+      <w:r>
+        <w:rPr>
+          <w:b/>
+        </w:rPr>
+        <w:t xml:space="preserve"> </w:t>
+      </w:r>
+      <w:proofErr w:type="spellStart"/>
+      <w:r>
+        <w:t>HyperText</w:t>
+      </w:r>
+      <w:proofErr w:type="spellEnd"/>
+      <w:r>
+        <w:t xml:space="preserve"> Transfer Protocol (</w:t>
+      </w:r>
+      <w:proofErr w:type="spellStart"/>
+      <w:r>
+        <w:t>Protocole</w:t>
+      </w:r>
+      <w:proofErr w:type="spellEnd"/>
+      <w:r>
+        <w:t xml:space="preserve"> de </w:t>
+      </w:r>
+      <w:proofErr w:type="spellStart"/>
+      <w:r>
+        <w:t>transfert</w:t>
+      </w:r>
+      <w:proofErr w:type="spellEnd"/>
+      <w:r>
+        <w:t xml:space="preserve"> </w:t>
+      </w:r>
+      <w:proofErr w:type="spellStart"/>
+      <w:r>
+        <w:t>hypertexte</w:t>
+      </w:r>
+      <w:proofErr w:type="spellEnd"/>
+      <w:r>
+        <w:t>)</w:t>
+      </w:r>
+    </w:p>
+    <w:p>
+      <w:pPr>
+        <w:spacing w:after="40"/>
+      </w:pPr>
+      <w:proofErr w:type="gramStart"/>
+      <w:r>
+        <w:rPr>
+          <w:b/>
+        </w:rPr>
+        <w:t>IDE :</w:t>
+      </w:r>
+      <w:proofErr w:type="gramEnd"/>
+      <w:r>
+        <w:rPr>
+          <w:b/>
+        </w:rPr>
+        <w:t xml:space="preserve"> </w:t>
+      </w:r>
+      <w:r>
+        <w:t xml:space="preserve">Integrated Development Environment (Environnement de </w:t>
+      </w:r>
+      <w:proofErr w:type="spellStart"/>
+      <w:r>
+        <w:t>développement</w:t>
+      </w:r>
+      <w:proofErr w:type="spellEnd"/>
+      <w:r>
+        <w:t xml:space="preserve"> </w:t>
+      </w:r>
+      <w:proofErr w:type="spellStart"/>
+      <w:r>
+        <w:t>intégré</w:t>
+      </w:r>
+      <w:proofErr w:type="spellEnd"/>
+      <w:r>
+        <w:t>)</w:t>
+      </w:r>
+    </w:p>
+    <w:p>
+      <w:pPr>
+        <w:spacing w:after="40"/>
+      </w:pPr>
+      <w:proofErr w:type="gramStart"/>
+      <w:r>
+        <w:rPr>
+          <w:b/>
+        </w:rPr>
+        <w:t>JDK :</w:t>
+      </w:r>
+      <w:proofErr w:type="gramEnd"/>
+      <w:r>
+        <w:rPr>
+          <w:b/>
+        </w:rPr>
+        <w:t xml:space="preserve"> </w:t>
+      </w:r>
+      <w:r>
+        <w:t xml:space="preserve">Java Development Kit (Kit de </w:t>
+      </w:r>
+      <w:proofErr w:type="spellStart"/>
+      <w:r>
+        <w:t>développement</w:t>
+      </w:r>
+      <w:proofErr w:type="spellEnd"/>
+      <w:r>
+        <w:t xml:space="preserve"> Java)</w:t>
+      </w:r>
+    </w:p>
+    <w:p>
+      <w:pPr>
+        <w:spacing w:after="40"/>
+      </w:pPr>
+      <w:proofErr w:type="gramStart"/>
+      <w:r>
+        <w:rPr>
+          <w:b/>
+        </w:rPr>
+        <w:t>JPA :</w:t>
+      </w:r>
+      <w:proofErr w:type="gramEnd"/>
+      <w:r>
+        <w:rPr>
+          <w:b/>
+        </w:rPr>
+        <w:t xml:space="preserve"> </w:t>
+      </w:r>
+      <w:r>
+        <w:t xml:space="preserve">Jakarta Persistence API (API de </w:t>
+      </w:r>
+      <w:proofErr w:type="spellStart"/>
+      <w:r>
+        <w:t>persistance</w:t>
+      </w:r>
+      <w:proofErr w:type="spellEnd"/>
+      <w:r>
+        <w:t xml:space="preserve"> Jakarta)</w:t>
+      </w:r>
+    </w:p>
+    <w:p>
+      <w:pPr>
+        <w:spacing w:after="40"/>
+      </w:pPr>
+      <w:proofErr w:type="gramStart"/>
+      <w:r>
+        <w:rPr>
+          <w:b/>
+        </w:rPr>
+        <w:t>JSON :</w:t>
+      </w:r>
+      <w:proofErr w:type="gramEnd"/>
+      <w:r>
+        <w:rPr>
+          <w:b/>
+        </w:rPr>
+        <w:t xml:space="preserve"> </w:t>
+      </w:r>
+      <w:r>
+        <w:t xml:space="preserve">JavaScript Object Notation (Notation </w:t>
+      </w:r>
+      <w:proofErr w:type="spellStart"/>
+      <w:r>
+        <w:t>objet</w:t>
+      </w:r>
+      <w:proofErr w:type="spellEnd"/>
+      <w:r>
+        <w:t xml:space="preserve"> JavaScript)</w:t>
+      </w:r>
+    </w:p>
+    <w:p>
+      <w:pPr>
+        <w:spacing w:after="40"/>
+      </w:pPr>
+      <w:proofErr w:type="gramStart"/>
+      <w:r>
+        <w:rPr>
+          <w:b/>
+        </w:rPr>
+        <w:t>JWT :</w:t>
+      </w:r>
+      <w:proofErr w:type="gramEnd"/>
+      <w:r>
+        <w:rPr>
+          <w:b/>
+        </w:rPr>
+        <w:t xml:space="preserve"> </w:t>
+      </w:r>
+      <w:r>
+        <w:t>JSON Web Token (Jeton web JSON)</w:t>
+      </w:r>
+    </w:p>
+    <w:p>
+      <w:pPr>
+        <w:spacing w:after="40"/>
+      </w:pPr>
+      <w:proofErr w:type="gramStart"/>
+      <w:r>
+        <w:rPr>
+          <w:b/>
+        </w:rPr>
+        <w:t>JVM :</w:t>
+      </w:r>
+      <w:proofErr w:type="gramEnd"/>
+      <w:r>
+        <w:rPr>
+          <w:b/>
+        </w:rPr>
+        <w:t xml:space="preserve"> </w:t>
+      </w:r>
+      <w:r>
+        <w:t xml:space="preserve">Java Virtual Machine (Machine </w:t>
+      </w:r>
+      <w:proofErr w:type="spellStart"/>
+      <w:r>
+        <w:t>virtuelle</w:t>
+      </w:r>
+      <w:proofErr w:type="spellEnd"/>
+      <w:r>
+        <w:t xml:space="preserve"> Java)</w:t>
+      </w:r>
+    </w:p>
+    <w:p>
+      <w:pPr>
+        <w:spacing w:after="40"/>
+      </w:pPr>
+      <w:proofErr w:type="gramStart"/>
+      <w:r>
+        <w:rPr>
+          <w:b/>
+        </w:rPr>
+        <w:t>MVC :</w:t>
+      </w:r>
+      <w:proofErr w:type="gramEnd"/>
+      <w:r>
+        <w:rPr>
+          <w:b/>
+        </w:rPr>
+        <w:t xml:space="preserve"> </w:t>
+      </w:r>
+      <w:r>
+        <w:t>Model-View-Controller (</w:t>
+      </w:r>
+      <w:proofErr w:type="spellStart"/>
+      <w:r>
+        <w:t>Modèle</w:t>
+      </w:r>
+      <w:proofErr w:type="spellEnd"/>
+      <w:r>
+        <w:t>-Vue-</w:t>
+      </w:r>
+      <w:proofErr w:type="spellStart"/>
+      <w:r>
+        <w:t>Contrôleur</w:t>
+      </w:r>
+      <w:proofErr w:type="spellEnd"/>
+      <w:r>
+        <w:t>)</w:t>
+      </w:r>
+    </w:p>
+    <w:p>
+      <w:pPr>
+        <w:spacing w:after="40"/>
+      </w:pPr>
+      <w:proofErr w:type="gramStart"/>
+      <w:r>
+        <w:rPr>
+          <w:b/>
+        </w:rPr>
+        <w:t>ORM :</w:t>
+      </w:r>
+      <w:proofErr w:type="gramEnd"/>
+      <w:r>
+        <w:rPr>
+          <w:b/>
+        </w:rPr>
+        <w:t xml:space="preserve"> </w:t>
+      </w:r>
+      <w:r>
+        <w:t xml:space="preserve">Object-Relational Mapping (Mapping </w:t>
+      </w:r>
+      <w:proofErr w:type="spellStart"/>
+      <w:r>
+        <w:t>objet-relationnel</w:t>
+      </w:r>
+      <w:proofErr w:type="spellEnd"/>
+      <w:r>
+        <w:t>)</w:t>
+      </w:r>
+    </w:p>
+    <w:p>
+      <w:pPr>
+        <w:spacing w:after="40"/>
+      </w:pPr>
+      <w:proofErr w:type="gramStart"/>
+      <w:r>
+        <w:rPr>
+          <w:b/>
+        </w:rPr>
+        <w:t>PFE :</w:t>
+      </w:r>
+      <w:proofErr w:type="gramEnd"/>
+      <w:r>
+        <w:rPr>
+          <w:b/>
+        </w:rPr>
+        <w:t xml:space="preserve"> </w:t>
+      </w:r>
+      <w:proofErr w:type="spellStart"/>
+      <w:r>
+        <w:t>Projet</w:t>
+      </w:r>
+      <w:proofErr w:type="spellEnd"/>
+      <w:r>
+        <w:t xml:space="preserve"> de Fin </w:t>
+      </w:r>
+      <w:proofErr w:type="spellStart"/>
+      <w:r>
+        <w:t>d'Études</w:t>
+      </w:r>
+      <w:proofErr w:type="spellEnd"/>
+    </w:p>
+    <w:p>
+      <w:pPr>
+        <w:spacing w:after="40"/>
+      </w:pPr>
+      <w:proofErr w:type="gramStart"/>
+      <w:r>
+        <w:rPr>
+          <w:b/>
+        </w:rPr>
+        <w:t>REST :</w:t>
+      </w:r>
+      <w:proofErr w:type="gramEnd"/>
+      <w:r>
+        <w:rPr>
+          <w:b/>
+        </w:rPr>
+        <w:t xml:space="preserve"> </w:t>
+      </w:r>
+      <w:r>
+        <w:t>Representational State Transfer (</w:t>
+      </w:r>
+      <w:proofErr w:type="spellStart"/>
+      <w:r>
+        <w:t>Transfert</w:t>
+      </w:r>
+      <w:proofErr w:type="spellEnd"/>
+      <w:r>
+        <w:t xml:space="preserve"> d'état </w:t>
+      </w:r>
+      <w:proofErr w:type="spellStart"/>
+      <w:r>
+        <w:t>représentationnel</w:t>
+      </w:r>
+      <w:proofErr w:type="spellEnd"/>
+      <w:r>
+        <w:t>)</w:t>
+      </w:r>
+    </w:p>
+    <w:p>
+      <w:pPr>
+        <w:spacing w:after="40"/>
+      </w:pPr>
+      <w:proofErr w:type="gramStart"/>
+      <w:r>
+        <w:rPr>
+          <w:b/>
+        </w:rPr>
+        <w:t>SPA :</w:t>
+      </w:r>
+      <w:proofErr w:type="gramEnd"/>
+      <w:r>
+        <w:rPr>
+          <w:b/>
+        </w:rPr>
+        <w:t xml:space="preserve"> </w:t>
+      </w:r>
+      <w:r>
+        <w:t xml:space="preserve">Single Page Application (Application </w:t>
+      </w:r>
+      <w:proofErr w:type="spellStart"/>
+      <w:r>
+        <w:t>monopage</w:t>
+      </w:r>
+      <w:proofErr w:type="spellEnd"/>
+      <w:r>
+        <w:t>)</w:t>
+      </w:r>
+    </w:p>
+    <w:p>
+      <w:pPr>
+        <w:spacing w:after="40"/>
+      </w:pPr>
+      <w:proofErr w:type="gramStart"/>
+      <w:r>
+        <w:rPr>
+          <w:b/>
+        </w:rPr>
+        <w:t>SQL :</w:t>
+      </w:r>
+      <w:proofErr w:type="gramEnd"/>
+      <w:r>
+        <w:rPr>
+          <w:b/>
+        </w:rPr>
+        <w:t xml:space="preserve"> </w:t>
+      </w:r>
+      <w:r>
+        <w:t>Structured Query Language (</w:t>
+      </w:r>
+      <w:proofErr w:type="spellStart"/>
+      <w:r>
+        <w:t>Langage</w:t>
+      </w:r>
+      <w:proofErr w:type="spellEnd"/>
+      <w:r>
+        <w:t xml:space="preserve"> de </w:t>
+      </w:r>
+      <w:proofErr w:type="spellStart"/>
+      <w:r>
+        <w:t>requête</w:t>
+      </w:r>
+      <w:proofErr w:type="spellEnd"/>
+      <w:r>
+        <w:t xml:space="preserve"> </w:t>
+      </w:r>
+      <w:proofErr w:type="spellStart"/>
+      <w:r>
+        <w:t>structuré</w:t>
+      </w:r>
+      <w:proofErr w:type="spellEnd"/>
+      <w:r>
+        <w:t>)</w:t>
+      </w:r>
+    </w:p>
+    <w:p>
+      <w:pPr>
+        <w:spacing w:after="40"/>
+      </w:pPr>
+      <w:proofErr w:type="gramStart"/>
+      <w:r>
+        <w:rPr>
+          <w:b/>
+        </w:rPr>
+        <w:t>UML :</w:t>
+      </w:r>
+      <w:proofErr w:type="gramEnd"/>
+      <w:r>
+        <w:rPr>
+          <w:b/>
+        </w:rPr>
+        <w:t xml:space="preserve"> </w:t>
+      </w:r>
+      <w:r>
+        <w:t>Unified Modeling Language (</w:t>
+      </w:r>
+      <w:proofErr w:type="spellStart"/>
+      <w:r>
+        <w:t>Langage</w:t>
+      </w:r>
+      <w:proofErr w:type="spellEnd"/>
+      <w:r>
+        <w:t xml:space="preserve"> de </w:t>
+      </w:r>
+      <w:proofErr w:type="spellStart"/>
+      <w:r>
+        <w:t>modélisation</w:t>
+      </w:r>
+      <w:proofErr w:type="spellEnd"/>
+      <w:r>
+        <w:t xml:space="preserve"> </w:t>
+      </w:r>
+      <w:proofErr w:type="spellStart"/>
+      <w:r>
+        <w:t>unifié</w:t>
+      </w:r>
+      <w:proofErr w:type="spellEnd"/>
+      <w:r>
+        <w:t>)</w:t>
+      </w:r>
+    </w:p>
+    <w:p>
+      <w:pPr>
+        <w:spacing w:after="40"/>
+      </w:pPr>
+      <w:proofErr w:type="gramStart"/>
+      <w:r>
+        <w:rPr>
+          <w:b/>
+        </w:rPr>
+        <w:t>UX :</w:t>
+      </w:r>
+      <w:proofErr w:type="gramEnd"/>
+      <w:r>
+        <w:rPr>
+          <w:b/>
+        </w:rPr>
+        <w:t xml:space="preserve"> </w:t>
+      </w:r>
+      <w:r>
+        <w:t>User Experience (</w:t>
+      </w:r>
+      <w:proofErr w:type="spellStart"/>
+      <w:r>
+        <w:t>Expérience</w:t>
+      </w:r>
+      <w:proofErr w:type="spellEnd"/>
+      <w:r>
+        <w:t xml:space="preserve"> </w:t>
+      </w:r>
+      <w:proofErr w:type="spellStart"/>
+      <w:r>
+        <w:t>utilisateur</w:t>
+      </w:r>
+      <w:proofErr w:type="spellEnd"/>
+      <w:r>
+        <w:t>)</w:t>
+      </w:r>
+    </w:p>
+    <w:p/>
+    <w:p/>
+    <w:p>
+      <w:pPr>
+        <w:spacing w:after="200" w:line="276" w:lineRule="auto"/>
+      </w:pPr>
+      <w:r>
+        <w:br w:type="page"/>
+      </w:r>
+    </w:p>
     <w:sdt>
       <w:sdtPr>
         <w:rPr>
-          <w:rFonts w:ascii="Times New Roman" w:eastAsiaTheme="minorEastAsia" w:hAnsi="Times New Roman" w:cs="Times New Roman"/>
-          <w:b w:val="0"/>
-          <w:bCs w:val="0"/>
-          <w:color w:val="000000" w:themeColor="text1"/>
+          <w:rFonts w:ascii="Times New Roman" w:hAnsi="Times New Roman" w:cs="Times New Roman"/>
+          <w:color w:val="auto"/>
           <w:sz w:val="32"/>
           <w:szCs w:val="32"/>
           <w:lang w:val="fr-FR"/>
         </w:rPr>
-        <w:id w:val="-1822185848"/>
+        <w:id w:val="1735654274"/>
         <w:docPartObj>
           <w:docPartGallery w:val="Table of Contents"/>
           <w:docPartUnique/>
@@ -7236,8 +7945,7 @@
       </w:sdtPr>
       <w:sdtEndPr>
         <w:rPr>
-          <w:rFonts w:cstheme="minorBidi"/>
-          <w:color w:val="auto"/>
+          <w:rFonts w:eastAsiaTheme="minorEastAsia" w:cstheme="minorBidi"/>
           <w:sz w:val="24"/>
           <w:szCs w:val="22"/>
           <w:lang w:val="en-US"/>
@@ -7249,7 +7957,7 @@
             <w:pStyle w:val="En-ttedetabledesmatires"/>
             <w:rPr>
               <w:rFonts w:ascii="Times New Roman" w:hAnsi="Times New Roman" w:cs="Times New Roman"/>
-              <w:color w:val="000000" w:themeColor="text1"/>
+              <w:color w:val="auto"/>
               <w:sz w:val="32"/>
               <w:szCs w:val="32"/>
             </w:rPr>
@@ -7257,7 +7965,7 @@
           <w:r>
             <w:rPr>
               <w:rFonts w:ascii="Times New Roman" w:hAnsi="Times New Roman" w:cs="Times New Roman"/>
-              <w:color w:val="000000" w:themeColor="text1"/>
+              <w:color w:val="auto"/>
               <w:sz w:val="32"/>
               <w:szCs w:val="32"/>
               <w:lang w:val="fr-FR"/>
@@ -7272,7 +7980,12 @@
               <w:tab w:val="right" w:leader="dot" w:pos="9396"/>
             </w:tabs>
             <w:rPr>
+              <w:rFonts w:asciiTheme="minorHAnsi" w:hAnsiTheme="minorHAnsi"/>
               <w:noProof/>
+              <w:kern w:val="2"/>
+              <w:szCs w:val="24"/>
+              <w:lang w:val="fr-FR" w:eastAsia="fr-FR"/>
+              <w14:ligatures w14:val="standardContextual"/>
             </w:rPr>
           </w:pPr>
           <w:r>
@@ -7284,7 +7997,7 @@
           <w:r>
             <w:fldChar w:fldCharType="separate"/>
           </w:r>
-          <w:hyperlink w:anchor="_Toc233982639" w:history="1">
+          <w:hyperlink w:anchor="_Toc234354166" w:history="1">
             <w:r>
               <w:rPr>
                 <w:rStyle w:val="Lienhypertexte"/>
@@ -7312,7 +8025,7 @@
                 <w:noProof/>
                 <w:webHidden/>
               </w:rPr>
-              <w:instrText xml:space="preserve"> PAGEREF _Toc233982639 \h </w:instrText>
+              <w:instrText xml:space="preserve"> PAGEREF _Toc234354166 \h </w:instrText>
             </w:r>
             <w:r>
               <w:rPr>
@@ -7350,10 +8063,15 @@
               <w:tab w:val="right" w:leader="dot" w:pos="9396"/>
             </w:tabs>
             <w:rPr>
+              <w:rFonts w:asciiTheme="minorHAnsi" w:hAnsiTheme="minorHAnsi"/>
               <w:noProof/>
+              <w:kern w:val="2"/>
+              <w:szCs w:val="24"/>
+              <w:lang w:val="fr-FR" w:eastAsia="fr-FR"/>
+              <w14:ligatures w14:val="standardContextual"/>
             </w:rPr>
           </w:pPr>
-          <w:hyperlink w:anchor="_Toc233982640" w:history="1">
+          <w:hyperlink w:anchor="_Toc234354167" w:history="1">
             <w:r>
               <w:rPr>
                 <w:rStyle w:val="Lienhypertexte"/>
@@ -7381,7 +8099,7 @@
                 <w:noProof/>
                 <w:webHidden/>
               </w:rPr>
-              <w:instrText xml:space="preserve"> PAGEREF _Toc233982640 \h </w:instrText>
+              <w:instrText xml:space="preserve"> PAGEREF _Toc234354167 \h </w:instrText>
             </w:r>
             <w:r>
               <w:rPr>
@@ -7419,10 +8137,15 @@
               <w:tab w:val="right" w:leader="dot" w:pos="9396"/>
             </w:tabs>
             <w:rPr>
+              <w:rFonts w:asciiTheme="minorHAnsi" w:hAnsiTheme="minorHAnsi"/>
               <w:noProof/>
+              <w:kern w:val="2"/>
+              <w:szCs w:val="24"/>
+              <w:lang w:val="fr-FR" w:eastAsia="fr-FR"/>
+              <w14:ligatures w14:val="standardContextual"/>
             </w:rPr>
           </w:pPr>
-          <w:hyperlink w:anchor="_Toc233982641" w:history="1">
+          <w:hyperlink w:anchor="_Toc234354168" w:history="1">
             <w:r>
               <w:rPr>
                 <w:rStyle w:val="Lienhypertexte"/>
@@ -7450,7 +8173,7 @@
                 <w:noProof/>
                 <w:webHidden/>
               </w:rPr>
-              <w:instrText xml:space="preserve"> PAGEREF _Toc233982641 \h </w:instrText>
+              <w:instrText xml:space="preserve"> PAGEREF _Toc234354168 \h </w:instrText>
             </w:r>
             <w:r>
               <w:rPr>
@@ -7488,17 +8211,22 @@
               <w:tab w:val="right" w:leader="dot" w:pos="9396"/>
             </w:tabs>
             <w:rPr>
+              <w:rFonts w:asciiTheme="minorHAnsi" w:hAnsiTheme="minorHAnsi"/>
               <w:noProof/>
+              <w:kern w:val="2"/>
+              <w:szCs w:val="24"/>
+              <w:lang w:val="fr-FR" w:eastAsia="fr-FR"/>
+              <w14:ligatures w14:val="standardContextual"/>
             </w:rPr>
           </w:pPr>
-          <w:hyperlink w:anchor="_Toc233982642" w:history="1">
+          <w:hyperlink w:anchor="_Toc234354169" w:history="1">
             <w:r>
               <w:rPr>
                 <w:rStyle w:val="Lienhypertexte"/>
                 <w:rFonts w:cs="Times New Roman"/>
                 <w:noProof/>
               </w:rPr>
-              <w:t>Résumé</w:t>
+              <w:t>Table des illustrations</w:t>
             </w:r>
             <w:r>
               <w:rPr>
@@ -7519,7 +8247,7 @@
                 <w:noProof/>
                 <w:webHidden/>
               </w:rPr>
-              <w:instrText xml:space="preserve"> PAGEREF _Toc233982642 \h </w:instrText>
+              <w:instrText xml:space="preserve"> PAGEREF _Toc234354169 \h </w:instrText>
             </w:r>
             <w:r>
               <w:rPr>
@@ -7539,7 +8267,7 @@
                 <w:noProof/>
                 <w:webHidden/>
               </w:rPr>
-              <w:t>vii</w:t>
+              <w:t>v</w:t>
             </w:r>
             <w:r>
               <w:rPr>
@@ -7557,17 +8285,22 @@
               <w:tab w:val="right" w:leader="dot" w:pos="9396"/>
             </w:tabs>
             <w:rPr>
+              <w:rFonts w:asciiTheme="minorHAnsi" w:hAnsiTheme="minorHAnsi"/>
               <w:noProof/>
+              <w:kern w:val="2"/>
+              <w:szCs w:val="24"/>
+              <w:lang w:val="fr-FR" w:eastAsia="fr-FR"/>
+              <w14:ligatures w14:val="standardContextual"/>
             </w:rPr>
           </w:pPr>
-          <w:hyperlink w:anchor="_Toc233982643" w:history="1">
+          <w:hyperlink w:anchor="_Toc234354170" w:history="1">
             <w:r>
               <w:rPr>
                 <w:rStyle w:val="Lienhypertexte"/>
                 <w:rFonts w:cs="Times New Roman"/>
                 <w:noProof/>
               </w:rPr>
-              <w:t>Abstract</w:t>
+              <w:t>Table des sigles et abréviations</w:t>
             </w:r>
             <w:r>
               <w:rPr>
@@ -7588,7 +8321,7 @@
                 <w:noProof/>
                 <w:webHidden/>
               </w:rPr>
-              <w:instrText xml:space="preserve"> PAGEREF _Toc233982643 \h </w:instrText>
+              <w:instrText xml:space="preserve"> PAGEREF _Toc234354170 \h </w:instrText>
             </w:r>
             <w:r>
               <w:rPr>
@@ -7608,7 +8341,7 @@
                 <w:noProof/>
                 <w:webHidden/>
               </w:rPr>
-              <w:t>viii</w:t>
+              <w:t>vi</w:t>
             </w:r>
             <w:r>
               <w:rPr>
@@ -7626,17 +8359,22 @@
               <w:tab w:val="right" w:leader="dot" w:pos="9396"/>
             </w:tabs>
             <w:rPr>
+              <w:rFonts w:asciiTheme="minorHAnsi" w:hAnsiTheme="minorHAnsi"/>
               <w:noProof/>
+              <w:kern w:val="2"/>
+              <w:szCs w:val="24"/>
+              <w:lang w:val="fr-FR" w:eastAsia="fr-FR"/>
+              <w14:ligatures w14:val="standardContextual"/>
             </w:rPr>
           </w:pPr>
-          <w:hyperlink w:anchor="_Toc233982644" w:history="1">
+          <w:hyperlink w:anchor="_Toc234354171" w:history="1">
             <w:r>
               <w:rPr>
                 <w:rStyle w:val="Lienhypertexte"/>
                 <w:rFonts w:cs="Times New Roman"/>
                 <w:noProof/>
               </w:rPr>
-              <w:t>Introduction</w:t>
+              <w:t>Résumé</w:t>
             </w:r>
             <w:r>
               <w:rPr>
@@ -7657,7 +8395,7 @@
                 <w:noProof/>
                 <w:webHidden/>
               </w:rPr>
-              <w:instrText xml:space="preserve"> PAGEREF _Toc233982644 \h </w:instrText>
+              <w:instrText xml:space="preserve"> PAGEREF _Toc234354171 \h </w:instrText>
             </w:r>
             <w:r>
               <w:rPr>
@@ -7677,7 +8415,7 @@
                 <w:noProof/>
                 <w:webHidden/>
               </w:rPr>
-              <w:t>1</w:t>
+              <w:t>vii</w:t>
             </w:r>
             <w:r>
               <w:rPr>
@@ -7695,10 +8433,163 @@
               <w:tab w:val="right" w:leader="dot" w:pos="9396"/>
             </w:tabs>
             <w:rPr>
+              <w:rFonts w:asciiTheme="minorHAnsi" w:hAnsiTheme="minorHAnsi"/>
               <w:noProof/>
+              <w:kern w:val="2"/>
+              <w:szCs w:val="24"/>
+              <w:lang w:val="fr-FR" w:eastAsia="fr-FR"/>
+              <w14:ligatures w14:val="standardContextual"/>
             </w:rPr>
           </w:pPr>
-          <w:hyperlink w:anchor="_Toc233982645" w:history="1">
+          <w:hyperlink w:anchor="_Toc234354172" w:history="1">
+            <w:r>
+              <w:rPr>
+                <w:rStyle w:val="Lienhypertexte"/>
+                <w:rFonts w:cs="Times New Roman"/>
+                <w:noProof/>
+              </w:rPr>
+              <w:t>Abstract</w:t>
+            </w:r>
+            <w:r>
+              <w:rPr>
+                <w:noProof/>
+                <w:webHidden/>
+              </w:rPr>
+              <w:tab/>
+            </w:r>
+            <w:r>
+              <w:rPr>
+                <w:noProof/>
+                <w:webHidden/>
+              </w:rPr>
+              <w:fldChar w:fldCharType="begin"/>
+            </w:r>
+            <w:r>
+              <w:rPr>
+                <w:noProof/>
+                <w:webHidden/>
+              </w:rPr>
+              <w:instrText xml:space="preserve"> PAGEREF _Toc234354172 \h </w:instrText>
+            </w:r>
+            <w:r>
+              <w:rPr>
+                <w:noProof/>
+                <w:webHidden/>
+              </w:rPr>
+            </w:r>
+            <w:r>
+              <w:rPr>
+                <w:noProof/>
+                <w:webHidden/>
+              </w:rPr>
+              <w:fldChar w:fldCharType="separate"/>
+            </w:r>
+            <w:r>
+              <w:rPr>
+                <w:noProof/>
+                <w:webHidden/>
+              </w:rPr>
+              <w:t>viii</w:t>
+            </w:r>
+            <w:r>
+              <w:rPr>
+                <w:noProof/>
+                <w:webHidden/>
+              </w:rPr>
+              <w:fldChar w:fldCharType="end"/>
+            </w:r>
+          </w:hyperlink>
+        </w:p>
+        <w:p>
+          <w:pPr>
+            <w:pStyle w:val="TM1"/>
+            <w:tabs>
+              <w:tab w:val="right" w:leader="dot" w:pos="9396"/>
+            </w:tabs>
+            <w:rPr>
+              <w:rFonts w:asciiTheme="minorHAnsi" w:hAnsiTheme="minorHAnsi"/>
+              <w:noProof/>
+              <w:kern w:val="2"/>
+              <w:szCs w:val="24"/>
+              <w:lang w:val="fr-FR" w:eastAsia="fr-FR"/>
+              <w14:ligatures w14:val="standardContextual"/>
+            </w:rPr>
+          </w:pPr>
+          <w:hyperlink w:anchor="_Toc234354173" w:history="1">
+            <w:r>
+              <w:rPr>
+                <w:rStyle w:val="Lienhypertexte"/>
+                <w:rFonts w:cs="Times New Roman"/>
+                <w:noProof/>
+              </w:rPr>
+              <w:t>Introduction</w:t>
+            </w:r>
+            <w:r>
+              <w:rPr>
+                <w:noProof/>
+                <w:webHidden/>
+              </w:rPr>
+              <w:tab/>
+            </w:r>
+            <w:r>
+              <w:rPr>
+                <w:noProof/>
+                <w:webHidden/>
+              </w:rPr>
+              <w:fldChar w:fldCharType="begin"/>
+            </w:r>
+            <w:r>
+              <w:rPr>
+                <w:noProof/>
+                <w:webHidden/>
+              </w:rPr>
+              <w:instrText xml:space="preserve"> PAGEREF _Toc234354173 \h </w:instrText>
+            </w:r>
+            <w:r>
+              <w:rPr>
+                <w:noProof/>
+                <w:webHidden/>
+              </w:rPr>
+            </w:r>
+            <w:r>
+              <w:rPr>
+                <w:noProof/>
+                <w:webHidden/>
+              </w:rPr>
+              <w:fldChar w:fldCharType="separate"/>
+            </w:r>
+            <w:r>
+              <w:rPr>
+                <w:noProof/>
+                <w:webHidden/>
+              </w:rPr>
+              <w:t>1</w:t>
+            </w:r>
+            <w:r>
+              <w:rPr>
+                <w:noProof/>
+                <w:webHidden/>
+              </w:rPr>
+              <w:fldChar w:fldCharType="end"/>
+            </w:r>
+          </w:hyperlink>
+        </w:p>
+        <w:p>
+          <w:pPr>
+            <w:pStyle w:val="TM1"/>
+            <w:tabs>
+              <w:tab w:val="right" w:leader="dot" w:pos="9396"/>
+            </w:tabs>
+            <w:rPr>
+              <w:rFonts w:asciiTheme="minorHAnsi" w:hAnsiTheme="minorHAnsi"/>
+              <w:noProof/>
+              <w:kern w:val="2"/>
+              <w:szCs w:val="24"/>
+              <w:lang w:val="fr-FR" w:eastAsia="fr-FR"/>
+              <w14:ligatures w14:val="standardContextual"/>
+            </w:rPr>
+          </w:pPr>
+          <w:hyperlink w:anchor="_Toc234354174" w:history="1">
             <w:r>
               <w:rPr>
                 <w:rStyle w:val="Lienhypertexte"/>
@@ -7726,7 +8617,7 @@
                 <w:noProof/>
                 <w:webHidden/>
               </w:rPr>
-              <w:instrText xml:space="preserve"> PAGEREF _Toc233982645 \h </w:instrText>
+              <w:instrText xml:space="preserve"> PAGEREF _Toc234354174 \h </w:instrText>
             </w:r>
             <w:r>
               <w:rPr>
@@ -7764,10 +8655,15 @@
               <w:tab w:val="right" w:leader="dot" w:pos="9396"/>
             </w:tabs>
             <w:rPr>
+              <w:rFonts w:asciiTheme="minorHAnsi" w:hAnsiTheme="minorHAnsi"/>
               <w:noProof/>
+              <w:kern w:val="2"/>
+              <w:szCs w:val="24"/>
+              <w:lang w:val="fr-FR" w:eastAsia="fr-FR"/>
+              <w14:ligatures w14:val="standardContextual"/>
             </w:rPr>
           </w:pPr>
-          <w:hyperlink w:anchor="_Toc233982646" w:history="1">
+          <w:hyperlink w:anchor="_Toc234354175" w:history="1">
             <w:r>
               <w:rPr>
                 <w:rStyle w:val="Lienhypertexte"/>
@@ -7795,7 +8691,7 @@
                 <w:noProof/>
                 <w:webHidden/>
               </w:rPr>
-              <w:instrText xml:space="preserve"> PAGEREF _Toc233982646 \h </w:instrText>
+              <w:instrText xml:space="preserve"> PAGEREF _Toc234354175 \h </w:instrText>
             </w:r>
             <w:r>
               <w:rPr>
@@ -7833,10 +8729,15 @@
               <w:tab w:val="right" w:leader="dot" w:pos="9396"/>
             </w:tabs>
             <w:rPr>
+              <w:rFonts w:asciiTheme="minorHAnsi" w:hAnsiTheme="minorHAnsi"/>
               <w:noProof/>
+              <w:kern w:val="2"/>
+              <w:szCs w:val="24"/>
+              <w:lang w:val="fr-FR" w:eastAsia="fr-FR"/>
+              <w14:ligatures w14:val="standardContextual"/>
             </w:rPr>
           </w:pPr>
-          <w:hyperlink w:anchor="_Toc233982647" w:history="1">
+          <w:hyperlink w:anchor="_Toc234354176" w:history="1">
             <w:r>
               <w:rPr>
                 <w:rStyle w:val="Lienhypertexte"/>
@@ -7864,7 +8765,7 @@
                 <w:noProof/>
                 <w:webHidden/>
               </w:rPr>
-              <w:instrText xml:space="preserve"> PAGEREF _Toc233982647 \h </w:instrText>
+              <w:instrText xml:space="preserve"> PAGEREF _Toc234354176 \h </w:instrText>
             </w:r>
             <w:r>
               <w:rPr>
@@ -7902,10 +8803,15 @@
               <w:tab w:val="right" w:leader="dot" w:pos="9396"/>
             </w:tabs>
             <w:rPr>
+              <w:rFonts w:asciiTheme="minorHAnsi" w:hAnsiTheme="minorHAnsi"/>
               <w:noProof/>
+              <w:kern w:val="2"/>
+              <w:szCs w:val="24"/>
+              <w:lang w:val="fr-FR" w:eastAsia="fr-FR"/>
+              <w14:ligatures w14:val="standardContextual"/>
             </w:rPr>
           </w:pPr>
-          <w:hyperlink w:anchor="_Toc233982648" w:history="1">
+          <w:hyperlink w:anchor="_Toc234354177" w:history="1">
             <w:r>
               <w:rPr>
                 <w:rStyle w:val="Lienhypertexte"/>
@@ -7933,7 +8839,7 @@
                 <w:noProof/>
                 <w:webHidden/>
               </w:rPr>
-              <w:instrText xml:space="preserve"> PAGEREF _Toc233982648 \h </w:instrText>
+              <w:instrText xml:space="preserve"> PAGEREF _Toc234354177 \h </w:instrText>
             </w:r>
             <w:r>
               <w:rPr>
@@ -7971,10 +8877,15 @@
               <w:tab w:val="right" w:leader="dot" w:pos="9396"/>
             </w:tabs>
             <w:rPr>
+              <w:rFonts w:asciiTheme="minorHAnsi" w:hAnsiTheme="minorHAnsi"/>
               <w:noProof/>
+              <w:kern w:val="2"/>
+              <w:szCs w:val="24"/>
+              <w:lang w:val="fr-FR" w:eastAsia="fr-FR"/>
+              <w14:ligatures w14:val="standardContextual"/>
             </w:rPr>
           </w:pPr>
-          <w:hyperlink w:anchor="_Toc233982649" w:history="1">
+          <w:hyperlink w:anchor="_Toc234354178" w:history="1">
             <w:r>
               <w:rPr>
                 <w:rStyle w:val="Lienhypertexte"/>
@@ -8002,7 +8913,7 @@
                 <w:noProof/>
                 <w:webHidden/>
               </w:rPr>
-              <w:instrText xml:space="preserve"> PAGEREF _Toc233982649 \h </w:instrText>
+              <w:instrText xml:space="preserve"> PAGEREF _Toc234354178 \h </w:instrText>
             </w:r>
             <w:r>
               <w:rPr>
@@ -8040,10 +8951,15 @@
               <w:tab w:val="right" w:leader="dot" w:pos="9396"/>
             </w:tabs>
             <w:rPr>
+              <w:rFonts w:asciiTheme="minorHAnsi" w:hAnsiTheme="minorHAnsi"/>
               <w:noProof/>
+              <w:kern w:val="2"/>
+              <w:szCs w:val="24"/>
+              <w:lang w:val="fr-FR" w:eastAsia="fr-FR"/>
+              <w14:ligatures w14:val="standardContextual"/>
             </w:rPr>
           </w:pPr>
-          <w:hyperlink w:anchor="_Toc233982650" w:history="1">
+          <w:hyperlink w:anchor="_Toc234354179" w:history="1">
             <w:r>
               <w:rPr>
                 <w:rStyle w:val="Lienhypertexte"/>
@@ -8071,7 +8987,7 @@
                 <w:noProof/>
                 <w:webHidden/>
               </w:rPr>
-              <w:instrText xml:space="preserve"> PAGEREF _Toc233982650 \h </w:instrText>
+              <w:instrText xml:space="preserve"> PAGEREF _Toc234354179 \h </w:instrText>
             </w:r>
             <w:r>
               <w:rPr>
@@ -8109,10 +9025,15 @@
               <w:tab w:val="right" w:leader="dot" w:pos="9396"/>
             </w:tabs>
             <w:rPr>
+              <w:rFonts w:asciiTheme="minorHAnsi" w:hAnsiTheme="minorHAnsi"/>
               <w:noProof/>
+              <w:kern w:val="2"/>
+              <w:szCs w:val="24"/>
+              <w:lang w:val="fr-FR" w:eastAsia="fr-FR"/>
+              <w14:ligatures w14:val="standardContextual"/>
             </w:rPr>
           </w:pPr>
-          <w:hyperlink w:anchor="_Toc233982651" w:history="1">
+          <w:hyperlink w:anchor="_Toc234354180" w:history="1">
             <w:r>
               <w:rPr>
                 <w:rStyle w:val="Lienhypertexte"/>
@@ -8140,7 +9061,7 @@
                 <w:noProof/>
                 <w:webHidden/>
               </w:rPr>
-              <w:instrText xml:space="preserve"> PAGEREF _Toc233982651 \h </w:instrText>
+              <w:instrText xml:space="preserve"> PAGEREF _Toc234354180 \h </w:instrText>
             </w:r>
             <w:r>
               <w:rPr>
@@ -8178,10 +9099,15 @@
               <w:tab w:val="right" w:leader="dot" w:pos="9396"/>
             </w:tabs>
             <w:rPr>
+              <w:rFonts w:asciiTheme="minorHAnsi" w:hAnsiTheme="minorHAnsi"/>
               <w:noProof/>
+              <w:kern w:val="2"/>
+              <w:szCs w:val="24"/>
+              <w:lang w:val="fr-FR" w:eastAsia="fr-FR"/>
+              <w14:ligatures w14:val="standardContextual"/>
             </w:rPr>
           </w:pPr>
-          <w:hyperlink w:anchor="_Toc233982652" w:history="1">
+          <w:hyperlink w:anchor="_Toc234354181" w:history="1">
             <w:r>
               <w:rPr>
                 <w:rStyle w:val="Lienhypertexte"/>
@@ -8209,7 +9135,7 @@
                 <w:noProof/>
                 <w:webHidden/>
               </w:rPr>
-              <w:instrText xml:space="preserve"> PAGEREF _Toc233982652 \h </w:instrText>
+              <w:instrText xml:space="preserve"> PAGEREF _Toc234354181 \h </w:instrText>
             </w:r>
             <w:r>
               <w:rPr>
@@ -8247,10 +9173,15 @@
               <w:tab w:val="right" w:leader="dot" w:pos="9396"/>
             </w:tabs>
             <w:rPr>
+              <w:rFonts w:asciiTheme="minorHAnsi" w:hAnsiTheme="minorHAnsi"/>
               <w:noProof/>
+              <w:kern w:val="2"/>
+              <w:szCs w:val="24"/>
+              <w:lang w:val="fr-FR" w:eastAsia="fr-FR"/>
+              <w14:ligatures w14:val="standardContextual"/>
             </w:rPr>
           </w:pPr>
-          <w:hyperlink w:anchor="_Toc233982653" w:history="1">
+          <w:hyperlink w:anchor="_Toc234354182" w:history="1">
             <w:r>
               <w:rPr>
                 <w:rStyle w:val="Lienhypertexte"/>
@@ -8278,7 +9209,7 @@
                 <w:noProof/>
                 <w:webHidden/>
               </w:rPr>
-              <w:instrText xml:space="preserve"> PAGEREF _Toc233982653 \h </w:instrText>
+              <w:instrText xml:space="preserve"> PAGEREF _Toc234354182 \h </w:instrText>
             </w:r>
             <w:r>
               <w:rPr>
@@ -8316,10 +9247,15 @@
               <w:tab w:val="right" w:leader="dot" w:pos="9396"/>
             </w:tabs>
             <w:rPr>
+              <w:rFonts w:asciiTheme="minorHAnsi" w:hAnsiTheme="minorHAnsi"/>
               <w:noProof/>
+              <w:kern w:val="2"/>
+              <w:szCs w:val="24"/>
+              <w:lang w:val="fr-FR" w:eastAsia="fr-FR"/>
+              <w14:ligatures w14:val="standardContextual"/>
             </w:rPr>
           </w:pPr>
-          <w:hyperlink w:anchor="_Toc233982654" w:history="1">
+          <w:hyperlink w:anchor="_Toc234354183" w:history="1">
             <w:r>
               <w:rPr>
                 <w:rStyle w:val="Lienhypertexte"/>
@@ -8347,7 +9283,7 @@
                 <w:noProof/>
                 <w:webHidden/>
               </w:rPr>
-              <w:instrText xml:space="preserve"> PAGEREF _Toc233982654 \h </w:instrText>
+              <w:instrText xml:space="preserve"> PAGEREF _Toc234354183 \h </w:instrText>
             </w:r>
             <w:r>
               <w:rPr>
@@ -8385,10 +9321,15 @@
               <w:tab w:val="right" w:leader="dot" w:pos="9396"/>
             </w:tabs>
             <w:rPr>
+              <w:rFonts w:asciiTheme="minorHAnsi" w:hAnsiTheme="minorHAnsi"/>
               <w:noProof/>
+              <w:kern w:val="2"/>
+              <w:szCs w:val="24"/>
+              <w:lang w:val="fr-FR" w:eastAsia="fr-FR"/>
+              <w14:ligatures w14:val="standardContextual"/>
             </w:rPr>
           </w:pPr>
-          <w:hyperlink w:anchor="_Toc233982655" w:history="1">
+          <w:hyperlink w:anchor="_Toc234354184" w:history="1">
             <w:r>
               <w:rPr>
                 <w:rStyle w:val="Lienhypertexte"/>
@@ -8416,7 +9357,7 @@
                 <w:noProof/>
                 <w:webHidden/>
               </w:rPr>
-              <w:instrText xml:space="preserve"> PAGEREF _Toc233982655 \h </w:instrText>
+              <w:instrText xml:space="preserve"> PAGEREF _Toc234354184 \h </w:instrText>
             </w:r>
             <w:r>
               <w:rPr>
@@ -8454,10 +9395,15 @@
               <w:tab w:val="right" w:leader="dot" w:pos="9396"/>
             </w:tabs>
             <w:rPr>
+              <w:rFonts w:asciiTheme="minorHAnsi" w:hAnsiTheme="minorHAnsi"/>
               <w:noProof/>
+              <w:kern w:val="2"/>
+              <w:szCs w:val="24"/>
+              <w:lang w:val="fr-FR" w:eastAsia="fr-FR"/>
+              <w14:ligatures w14:val="standardContextual"/>
             </w:rPr>
           </w:pPr>
-          <w:hyperlink w:anchor="_Toc233982656" w:history="1">
+          <w:hyperlink w:anchor="_Toc234354185" w:history="1">
             <w:r>
               <w:rPr>
                 <w:rStyle w:val="Lienhypertexte"/>
@@ -8485,7 +9431,7 @@
                 <w:noProof/>
                 <w:webHidden/>
               </w:rPr>
-              <w:instrText xml:space="preserve"> PAGEREF _Toc233982656 \h </w:instrText>
+              <w:instrText xml:space="preserve"> PAGEREF _Toc234354185 \h </w:instrText>
             </w:r>
             <w:r>
               <w:rPr>
@@ -8523,10 +9469,15 @@
               <w:tab w:val="right" w:leader="dot" w:pos="9396"/>
             </w:tabs>
             <w:rPr>
+              <w:rFonts w:asciiTheme="minorHAnsi" w:hAnsiTheme="minorHAnsi"/>
               <w:noProof/>
+              <w:kern w:val="2"/>
+              <w:szCs w:val="24"/>
+              <w:lang w:val="fr-FR" w:eastAsia="fr-FR"/>
+              <w14:ligatures w14:val="standardContextual"/>
             </w:rPr>
           </w:pPr>
-          <w:hyperlink w:anchor="_Toc233982657" w:history="1">
+          <w:hyperlink w:anchor="_Toc234354186" w:history="1">
             <w:r>
               <w:rPr>
                 <w:rStyle w:val="Lienhypertexte"/>
@@ -8554,7 +9505,7 @@
                 <w:noProof/>
                 <w:webHidden/>
               </w:rPr>
-              <w:instrText xml:space="preserve"> PAGEREF _Toc233982657 \h </w:instrText>
+              <w:instrText xml:space="preserve"> PAGEREF _Toc234354186 \h </w:instrText>
             </w:r>
             <w:r>
               <w:rPr>
@@ -8592,10 +9543,15 @@
               <w:tab w:val="right" w:leader="dot" w:pos="9396"/>
             </w:tabs>
             <w:rPr>
+              <w:rFonts w:asciiTheme="minorHAnsi" w:hAnsiTheme="minorHAnsi"/>
               <w:noProof/>
+              <w:kern w:val="2"/>
+              <w:szCs w:val="24"/>
+              <w:lang w:val="fr-FR" w:eastAsia="fr-FR"/>
+              <w14:ligatures w14:val="standardContextual"/>
             </w:rPr>
           </w:pPr>
-          <w:hyperlink w:anchor="_Toc233982658" w:history="1">
+          <w:hyperlink w:anchor="_Toc234354187" w:history="1">
             <w:r>
               <w:rPr>
                 <w:rStyle w:val="Lienhypertexte"/>
@@ -8623,7 +9579,7 @@
                 <w:noProof/>
                 <w:webHidden/>
               </w:rPr>
-              <w:instrText xml:space="preserve"> PAGEREF _Toc233982658 \h </w:instrText>
+              <w:instrText xml:space="preserve"> PAGEREF _Toc234354187 \h </w:instrText>
             </w:r>
             <w:r>
               <w:rPr>
@@ -8661,10 +9617,15 @@
               <w:tab w:val="right" w:leader="dot" w:pos="9396"/>
             </w:tabs>
             <w:rPr>
+              <w:rFonts w:asciiTheme="minorHAnsi" w:hAnsiTheme="minorHAnsi"/>
               <w:noProof/>
+              <w:kern w:val="2"/>
+              <w:szCs w:val="24"/>
+              <w:lang w:val="fr-FR" w:eastAsia="fr-FR"/>
+              <w14:ligatures w14:val="standardContextual"/>
             </w:rPr>
           </w:pPr>
-          <w:hyperlink w:anchor="_Toc233982659" w:history="1">
+          <w:hyperlink w:anchor="_Toc234354188" w:history="1">
             <w:r>
               <w:rPr>
                 <w:rStyle w:val="Lienhypertexte"/>
@@ -8692,7 +9653,7 @@
                 <w:noProof/>
                 <w:webHidden/>
               </w:rPr>
-              <w:instrText xml:space="preserve"> PAGEREF _Toc233982659 \h </w:instrText>
+              <w:instrText xml:space="preserve"> PAGEREF _Toc234354188 \h </w:instrText>
             </w:r>
             <w:r>
               <w:rPr>
@@ -8730,10 +9691,15 @@
               <w:tab w:val="right" w:leader="dot" w:pos="9396"/>
             </w:tabs>
             <w:rPr>
+              <w:rFonts w:asciiTheme="minorHAnsi" w:hAnsiTheme="minorHAnsi"/>
               <w:noProof/>
+              <w:kern w:val="2"/>
+              <w:szCs w:val="24"/>
+              <w:lang w:val="fr-FR" w:eastAsia="fr-FR"/>
+              <w14:ligatures w14:val="standardContextual"/>
             </w:rPr>
           </w:pPr>
-          <w:hyperlink w:anchor="_Toc233982660" w:history="1">
+          <w:hyperlink w:anchor="_Toc234354189" w:history="1">
             <w:r>
               <w:rPr>
                 <w:rStyle w:val="Lienhypertexte"/>
@@ -8761,7 +9727,7 @@
                 <w:noProof/>
                 <w:webHidden/>
               </w:rPr>
-              <w:instrText xml:space="preserve"> PAGEREF _Toc233982660 \h </w:instrText>
+              <w:instrText xml:space="preserve"> PAGEREF _Toc234354189 \h </w:instrText>
             </w:r>
             <w:r>
               <w:rPr>
@@ -8799,17 +9765,22 @@
               <w:tab w:val="right" w:leader="dot" w:pos="9396"/>
             </w:tabs>
             <w:rPr>
+              <w:rFonts w:asciiTheme="minorHAnsi" w:hAnsiTheme="minorHAnsi"/>
               <w:noProof/>
+              <w:kern w:val="2"/>
+              <w:szCs w:val="24"/>
+              <w:lang w:val="fr-FR" w:eastAsia="fr-FR"/>
+              <w14:ligatures w14:val="standardContextual"/>
             </w:rPr>
           </w:pPr>
-          <w:hyperlink w:anchor="_Toc233982661" w:history="1">
+          <w:hyperlink w:anchor="_Toc234354190" w:history="1">
             <w:r>
               <w:rPr>
                 <w:rStyle w:val="Lienhypertexte"/>
                 <w:rFonts w:cs="Times New Roman"/>
                 <w:noProof/>
               </w:rPr>
-              <w:t>Glossaire</w:t>
+              <w:t>Annexes</w:t>
             </w:r>
             <w:r>
               <w:rPr>
@@ -8830,7 +9801,7 @@
                 <w:noProof/>
                 <w:webHidden/>
               </w:rPr>
-              <w:instrText xml:space="preserve"> PAGEREF _Toc233982661 \h </w:instrText>
+              <w:instrText xml:space="preserve"> PAGEREF _Toc234354190 \h </w:instrText>
             </w:r>
             <w:r>
               <w:rPr>
@@ -8850,7 +9821,7 @@
                 <w:noProof/>
                 <w:webHidden/>
               </w:rPr>
-              <w:t>ii</w:t>
+              <w:t>i</w:t>
             </w:r>
             <w:r>
               <w:rPr>
@@ -8868,17 +9839,22 @@
               <w:tab w:val="right" w:leader="dot" w:pos="9396"/>
             </w:tabs>
             <w:rPr>
+              <w:rFonts w:asciiTheme="minorHAnsi" w:hAnsiTheme="minorHAnsi"/>
               <w:noProof/>
+              <w:kern w:val="2"/>
+              <w:szCs w:val="24"/>
+              <w:lang w:val="fr-FR" w:eastAsia="fr-FR"/>
+              <w14:ligatures w14:val="standardContextual"/>
             </w:rPr>
           </w:pPr>
-          <w:hyperlink w:anchor="_Toc233982662" w:history="1">
+          <w:hyperlink w:anchor="_Toc234354191" w:history="1">
             <w:r>
               <w:rPr>
                 <w:rStyle w:val="Lienhypertexte"/>
                 <w:rFonts w:cs="Times New Roman"/>
                 <w:noProof/>
               </w:rPr>
-              <w:t>Annexes</w:t>
+              <w:t>Glossaire</w:t>
             </w:r>
             <w:r>
               <w:rPr>
@@ -8899,7 +9875,7 @@
                 <w:noProof/>
                 <w:webHidden/>
               </w:rPr>
-              <w:instrText xml:space="preserve"> PAGEREF _Toc233982662 \h </w:instrText>
+              <w:instrText xml:space="preserve"> PAGEREF _Toc234354191 \h </w:instrText>
             </w:r>
             <w:r>
               <w:rPr>
@@ -8919,7 +9895,7 @@
                 <w:noProof/>
                 <w:webHidden/>
               </w:rPr>
-              <w:t>i</w:t>
+              <w:t>vii</w:t>
             </w:r>
             <w:r>
               <w:rPr>
@@ -8936,14 +9912,11 @@
               <w:b/>
               <w:bCs/>
             </w:rPr>
-            <w:lastRenderedPageBreak/>
             <w:fldChar w:fldCharType="end"/>
           </w:r>
         </w:p>
       </w:sdtContent>
     </w:sdt>
-    <w:p/>
-    <w:p/>
     <w:p/>
     <w:sectPr>
       <w:footerReference w:type="default" r:id="rId28"/>

</xml_diff>